<commit_message>
Fix: Error 400 en notas y UI alineación. Feat: Permisos contextuales y monitoreo
</commit_message>
<xml_diff>
--- a/proyecto_Rest_Cycle.docx
+++ b/proyecto_Rest_Cycle.docx
@@ -4,78 +4,145 @@
   <w:body>
     <w:p>
       <w:pPr>
-        <w:pStyle w:val="Ttulo"/>
-        <w:rPr>
-          <w:rFonts w:ascii="Arial" w:hAnsi="Arial" w:cs="Arial"/>
-          <w:color w:val="000000" w:themeColor="text1"/>
-          <w:sz w:val="24"/>
-          <w:szCs w:val="24"/>
-        </w:rPr>
-      </w:pPr>
-      <w:r>
-        <w:rPr>
-          <w:rFonts w:ascii="Arial" w:hAnsi="Arial" w:cs="Arial"/>
-          <w:color w:val="000000" w:themeColor="text1"/>
-          <w:sz w:val="24"/>
-          <w:szCs w:val="24"/>
-        </w:rPr>
-        <w:t>Proyecto de Software</w:t>
+        <w:jc w:val="center"/>
+        <w:rPr>
+          <w:rFonts w:ascii="Arial" w:hAnsi="Arial" w:cs="Arial"/>
+          <w:color w:val="000000" w:themeColor="text1"/>
+          <w:sz w:val="24"/>
+          <w:szCs w:val="24"/>
+        </w:rPr>
+      </w:pPr>
+      <w:r>
+        <w:rPr>
+          <w:rFonts w:ascii="Arial" w:hAnsi="Arial" w:cs="Arial"/>
+          <w:color w:val="000000" w:themeColor="text1"/>
+          <w:sz w:val="24"/>
+          <w:szCs w:val="24"/>
+        </w:rPr>
+        <w:t>Rest Cycle</w:t>
       </w:r>
     </w:p>
     <w:p>
       <w:pPr>
-        <w:pStyle w:val="Ttulo1"/>
-        <w:rPr>
-          <w:rFonts w:ascii="Arial" w:hAnsi="Arial" w:cs="Arial"/>
-          <w:b w:val="0"/>
-          <w:bCs w:val="0"/>
-          <w:color w:val="000000" w:themeColor="text1"/>
-          <w:sz w:val="24"/>
-          <w:szCs w:val="24"/>
-        </w:rPr>
-      </w:pPr>
-      <w:r>
-        <w:rPr>
-          <w:rFonts w:ascii="Arial" w:hAnsi="Arial" w:cs="Arial"/>
-          <w:b w:val="0"/>
-          <w:bCs w:val="0"/>
-          <w:color w:val="000000" w:themeColor="text1"/>
-          <w:sz w:val="24"/>
-          <w:szCs w:val="24"/>
-        </w:rPr>
-        <w:t>1. Título del Proyecto</w:t>
-      </w:r>
+        <w:rPr>
+          <w:rFonts w:ascii="Arial" w:hAnsi="Arial" w:cs="Arial"/>
+          <w:color w:val="000000" w:themeColor="text1"/>
+          <w:sz w:val="24"/>
+          <w:szCs w:val="24"/>
+        </w:rPr>
+      </w:pPr>
     </w:p>
     <w:p>
       <w:pPr>
-        <w:rPr>
-          <w:rFonts w:ascii="Arial" w:hAnsi="Arial" w:cs="Arial"/>
-          <w:color w:val="000000" w:themeColor="text1"/>
-          <w:sz w:val="24"/>
-          <w:szCs w:val="24"/>
-        </w:rPr>
-      </w:pPr>
-      <w:r>
-        <w:rPr>
-          <w:rFonts w:ascii="Arial" w:hAnsi="Arial" w:cs="Arial"/>
-          <w:color w:val="000000" w:themeColor="text1"/>
-          <w:sz w:val="24"/>
-          <w:szCs w:val="24"/>
-        </w:rPr>
-        <w:t>Nombre del Proyecto:</w:t>
-      </w:r>
-      <w:r>
-        <w:rPr>
-          <w:rFonts w:ascii="Arial" w:hAnsi="Arial" w:cs="Arial"/>
-          <w:color w:val="000000" w:themeColor="text1"/>
-          <w:sz w:val="24"/>
-          <w:szCs w:val="24"/>
-        </w:rPr>
-        <w:t xml:space="preserve"> Rest Cycle</w:t>
+        <w:jc w:val="center"/>
+      </w:pPr>
+      <w:r>
+        <w:br/>
+        <w:t>Andrey Alejandro Suesca Fuentes</w:t>
+      </w:r>
+      <w:r>
+        <w:br/>
+        <w:t>Charith Tatiana Martínez Camargo</w:t>
+      </w:r>
+      <w:r>
+        <w:br/>
+        <w:t>Cristian Felipe Alvarado Arias</w:t>
+      </w:r>
+      <w:r>
+        <w:br/>
+        <w:t>Diego Alejandro Sandoval Velandia</w:t>
       </w:r>
     </w:p>
     <w:p>
       <w:pPr>
+        <w:jc w:val="center"/>
+      </w:pPr>
+    </w:p>
+    <w:p>
+      <w:pPr>
+        <w:jc w:val="center"/>
+      </w:pPr>
+    </w:p>
+    <w:p>
+      <w:pPr>
+        <w:jc w:val="center"/>
+      </w:pPr>
+      <w:r>
+        <w:t>Instructor: Juan Fernando Jiménez R.</w:t>
+      </w:r>
+    </w:p>
+    <w:p>
+      <w:pPr>
+        <w:jc w:val="center"/>
+      </w:pPr>
+    </w:p>
+    <w:p>
+      <w:pPr>
+        <w:jc w:val="center"/>
+      </w:pPr>
+      <w:r>
+        <w:br/>
+        <w:t>Programa: Tecnólogo en Análisis y Desarrollo de Software – ADSO</w:t>
+      </w:r>
+      <w:r>
+        <w:br/>
+        <w:t>Ficha: 3000864</w:t>
+      </w:r>
+    </w:p>
+    <w:p>
+      <w:pPr>
+        <w:jc w:val="center"/>
+      </w:pPr>
+      <w:r>
+        <w:br/>
+        <w:t>Servicio Nacional de Aprendizaje – SENA</w:t>
+      </w:r>
+    </w:p>
+    <w:p>
+      <w:pPr>
+        <w:jc w:val="center"/>
+      </w:pPr>
+    </w:p>
+    <w:p>
+      <w:pPr>
+        <w:jc w:val="center"/>
+      </w:pPr>
+    </w:p>
+    <w:p>
+      <w:pPr>
+        <w:jc w:val="center"/>
+      </w:pPr>
+    </w:p>
+    <w:p>
+      <w:pPr>
+        <w:jc w:val="center"/>
+      </w:pPr>
+      <w:r>
+        <w:br/>
+      </w:r>
+      <w:r>
+        <w:t>Tunja, Colombia</w:t>
+      </w:r>
+      <w:r>
+        <w:br/>
+        <w:t>202</w:t>
+      </w:r>
+      <w:r>
+        <w:t>6</w:t>
+      </w:r>
+    </w:p>
+    <w:p>
+      <w:pPr>
+        <w:rPr>
+          <w:rFonts w:ascii="Arial" w:hAnsi="Arial" w:cs="Arial"/>
+          <w:color w:val="000000" w:themeColor="text1"/>
+          <w:sz w:val="24"/>
+          <w:szCs w:val="24"/>
+        </w:rPr>
+      </w:pPr>
+    </w:p>
+    <w:p>
+      <w:pPr>
         <w:pStyle w:val="Ttulo1"/>
         <w:rPr>
           <w:rFonts w:ascii="Arial" w:hAnsi="Arial" w:cs="Arial"/>
@@ -96,21 +163,19 @@
           <w:szCs w:val="24"/>
         </w:rPr>
         <w:lastRenderedPageBreak/>
-        <w:t xml:space="preserve">2. </w:t>
-      </w:r>
-      <w:proofErr w:type="spellStart"/>
-      <w:r>
-        <w:rPr>
-          <w:rFonts w:ascii="Arial" w:hAnsi="Arial" w:cs="Arial"/>
-          <w:b w:val="0"/>
-          <w:bCs w:val="0"/>
-          <w:color w:val="000000" w:themeColor="text1"/>
-          <w:sz w:val="24"/>
-          <w:szCs w:val="24"/>
-        </w:rPr>
-        <w:t>Iintroducción</w:t>
-      </w:r>
-      <w:proofErr w:type="spellEnd"/>
+        <w:t>I</w:t>
+      </w:r>
+      <w:r>
+        <w:rPr>
+          <w:rFonts w:ascii="Arial" w:hAnsi="Arial" w:cs="Arial"/>
+          <w:b w:val="0"/>
+          <w:bCs w:val="0"/>
+          <w:color w:val="000000" w:themeColor="text1"/>
+          <w:sz w:val="24"/>
+          <w:szCs w:val="24"/>
+        </w:rPr>
+        <w:t>ntroducción</w:t>
+      </w:r>
     </w:p>
     <w:p>
       <w:pPr>
@@ -639,17 +704,6 @@
           <w:sz w:val="24"/>
           <w:szCs w:val="24"/>
         </w:rPr>
-        <w:t xml:space="preserve">3. </w:t>
-      </w:r>
-      <w:r>
-        <w:rPr>
-          <w:rFonts w:ascii="Arial" w:hAnsi="Arial" w:cs="Arial"/>
-          <w:b w:val="0"/>
-          <w:bCs w:val="0"/>
-          <w:color w:val="000000" w:themeColor="text1"/>
-          <w:sz w:val="24"/>
-          <w:szCs w:val="24"/>
-        </w:rPr>
         <w:t>Equipo de Desarrollo o Responsables</w:t>
       </w:r>
     </w:p>
@@ -3424,7 +3478,7 @@
           <w:sz w:val="24"/>
           <w:szCs w:val="24"/>
         </w:rPr>
-        <w:t>5. Análisis del Sistema</w:t>
+        <w:t>Análisis del Sistema</w:t>
       </w:r>
     </w:p>
     <w:p>
@@ -3523,30 +3577,6 @@
           <w:szCs w:val="24"/>
         </w:rPr>
         <w:t>Diagramas</w:t>
-      </w:r>
-      <w:r>
-        <w:rPr>
-          <w:rFonts w:ascii="Arial" w:hAnsi="Arial" w:cs="Arial"/>
-          <w:b w:val="0"/>
-          <w:bCs w:val="0"/>
-          <w:color w:val="EE0000"/>
-          <w:sz w:val="24"/>
-          <w:szCs w:val="24"/>
-        </w:rPr>
-        <w:t>: </w:t>
-      </w:r>
-      <w:r>
-        <w:rPr>
-          <w:rFonts w:ascii="Arial" w:hAnsi="Arial" w:cs="Arial"/>
-          <w:b w:val="0"/>
-          <w:bCs w:val="0"/>
-          <w:i/>
-          <w:iCs/>
-          <w:color w:val="EE0000"/>
-          <w:sz w:val="24"/>
-          <w:szCs w:val="24"/>
-        </w:rPr>
-        <w:t>(Espacio reservado para diagramas UML: Casos de Uso, Clases, y Secuencia. Se recomienda incluir diagramas que muestren el flujo de Login y el flujo de Sincronización de Datos)</w:t>
       </w:r>
     </w:p>
     <w:p/>
@@ -3572,8 +3602,7 @@
           <w:sz w:val="24"/>
           <w:szCs w:val="24"/>
         </w:rPr>
-        <w:lastRenderedPageBreak/>
-        <w:t>6. Roles de Usuarios</w:t>
+        <w:t>Roles de Usuarios</w:t>
       </w:r>
     </w:p>
     <w:p>
@@ -3617,6 +3646,7 @@
           <w:sz w:val="24"/>
           <w:szCs w:val="24"/>
         </w:rPr>
+        <w:lastRenderedPageBreak/>
         <w:t>Administrador: Acceso total al panel de backend para gestión de usuarios, auditoría de logs y soporte técnico de nivel 2.</w:t>
       </w:r>
     </w:p>
@@ -3691,20 +3721,24 @@
         <w:pStyle w:val="Ttulo1"/>
         <w:rPr>
           <w:rFonts w:ascii="Arial" w:hAnsi="Arial" w:cs="Arial"/>
-          <w:color w:val="000000" w:themeColor="text1"/>
-          <w:sz w:val="24"/>
-          <w:szCs w:val="24"/>
-        </w:rPr>
-      </w:pPr>
-      <w:r>
-        <w:rPr>
-          <w:rFonts w:ascii="Arial" w:hAnsi="Arial" w:cs="Arial"/>
+          <w:b w:val="0"/>
+          <w:bCs w:val="0"/>
+          <w:color w:val="000000" w:themeColor="text1"/>
+          <w:sz w:val="24"/>
+          <w:szCs w:val="24"/>
+        </w:rPr>
+      </w:pPr>
+      <w:r>
+        <w:rPr>
+          <w:rFonts w:ascii="Arial" w:hAnsi="Arial" w:cs="Arial"/>
+          <w:b w:val="0"/>
+          <w:bCs w:val="0"/>
           <w:color w:val="000000" w:themeColor="text1"/>
           <w:sz w:val="24"/>
           <w:szCs w:val="24"/>
         </w:rPr>
         <w:lastRenderedPageBreak/>
-        <w:t>7. Diseño del Sistema</w:t>
+        <w:t>Diseño del Sistema</w:t>
       </w:r>
     </w:p>
     <w:p>
@@ -3712,14 +3746,18 @@
         <w:pStyle w:val="Ttulo2"/>
         <w:rPr>
           <w:rFonts w:ascii="Arial" w:hAnsi="Arial" w:cs="Arial"/>
-          <w:color w:val="000000" w:themeColor="text1"/>
-          <w:sz w:val="24"/>
-          <w:szCs w:val="24"/>
-        </w:rPr>
-      </w:pPr>
-      <w:r>
-        <w:rPr>
-          <w:rFonts w:ascii="Arial" w:hAnsi="Arial" w:cs="Arial"/>
+          <w:b w:val="0"/>
+          <w:bCs w:val="0"/>
+          <w:color w:val="000000" w:themeColor="text1"/>
+          <w:sz w:val="24"/>
+          <w:szCs w:val="24"/>
+        </w:rPr>
+      </w:pPr>
+      <w:r>
+        <w:rPr>
+          <w:rFonts w:ascii="Arial" w:hAnsi="Arial" w:cs="Arial"/>
+          <w:b w:val="0"/>
+          <w:bCs w:val="0"/>
           <w:color w:val="000000" w:themeColor="text1"/>
           <w:sz w:val="24"/>
           <w:szCs w:val="24"/>
@@ -3828,34 +3866,6 @@
           <w:sz w:val="24"/>
           <w:szCs w:val="24"/>
         </w:rPr>
-        <w:t>Inyección de Dependencias: Gestión eficiente de componentes para modularidad.</w:t>
-      </w:r>
-    </w:p>
-    <w:p>
-      <w:pPr>
-        <w:pStyle w:val="Ttulo1"/>
-        <w:numPr>
-          <w:ilvl w:val="0"/>
-          <w:numId w:val="18"/>
-        </w:numPr>
-        <w:rPr>
-          <w:rFonts w:ascii="Arial" w:hAnsi="Arial" w:cs="Arial"/>
-          <w:b w:val="0"/>
-          <w:bCs w:val="0"/>
-          <w:color w:val="000000" w:themeColor="text1"/>
-          <w:sz w:val="24"/>
-          <w:szCs w:val="24"/>
-        </w:rPr>
-      </w:pPr>
-      <w:r>
-        <w:rPr>
-          <w:rFonts w:ascii="Arial" w:hAnsi="Arial" w:cs="Arial"/>
-          <w:b w:val="0"/>
-          <w:bCs w:val="0"/>
-          <w:color w:val="000000" w:themeColor="text1"/>
-          <w:sz w:val="24"/>
-          <w:szCs w:val="24"/>
-        </w:rPr>
         <w:t>Programación Reactiva: Uso de </w:t>
       </w:r>
       <w:proofErr w:type="spellStart"/>
@@ -3880,31 +3890,18 @@
           <w:sz w:val="24"/>
           <w:szCs w:val="24"/>
         </w:rPr>
-        <w:t> y </w:t>
-      </w:r>
-      <w:proofErr w:type="spellStart"/>
-      <w:r>
-        <w:rPr>
-          <w:rFonts w:ascii="Arial" w:hAnsi="Arial" w:cs="Arial"/>
-          <w:b w:val="0"/>
-          <w:bCs w:val="0"/>
-          <w:color w:val="000000" w:themeColor="text1"/>
-          <w:sz w:val="24"/>
-          <w:szCs w:val="24"/>
-        </w:rPr>
-        <w:t>LiveData</w:t>
-      </w:r>
-      <w:proofErr w:type="spellEnd"/>
-      <w:r>
-        <w:rPr>
-          <w:rFonts w:ascii="Arial" w:hAnsi="Arial" w:cs="Arial"/>
-          <w:b w:val="0"/>
-          <w:bCs w:val="0"/>
-          <w:color w:val="000000" w:themeColor="text1"/>
-          <w:sz w:val="24"/>
-          <w:szCs w:val="24"/>
-        </w:rPr>
-        <w:t> para actualizar la interfaz automáticamente ante cambios en los datos.</w:t>
+        <w:t xml:space="preserve"> </w:t>
+      </w:r>
+      <w:r>
+        <w:rPr>
+          <w:rFonts w:ascii="Arial" w:hAnsi="Arial" w:cs="Arial"/>
+          <w:b w:val="0"/>
+          <w:bCs w:val="0"/>
+          <w:color w:val="000000" w:themeColor="text1"/>
+          <w:sz w:val="24"/>
+          <w:szCs w:val="24"/>
+        </w:rPr>
+        <w:t>para actualizar la interfaz automáticamente ante cambios en los datos.</w:t>
       </w:r>
     </w:p>
     <w:p>
@@ -4155,7 +4152,7 @@
           <w:sz w:val="24"/>
           <w:szCs w:val="24"/>
         </w:rPr>
-        <w:t>8. Implementación</w:t>
+        <w:t>Implementación</w:t>
       </w:r>
     </w:p>
     <w:p>
@@ -5113,94 +5110,400 @@
           <w:sz w:val="24"/>
           <w:szCs w:val="24"/>
         </w:rPr>
-        <w:t>9. Pruebas</w:t>
+        <w:t>Pruebas</w:t>
       </w:r>
     </w:p>
     <w:p>
       <w:pPr>
-        <w:rPr>
-          <w:rFonts w:ascii="Arial" w:hAnsi="Arial" w:cs="Arial"/>
-          <w:color w:val="000000" w:themeColor="text1"/>
-          <w:sz w:val="24"/>
-          <w:szCs w:val="24"/>
-        </w:rPr>
-      </w:pPr>
-      <w:r>
-        <w:rPr>
-          <w:rFonts w:ascii="Arial" w:hAnsi="Arial" w:cs="Arial"/>
-          <w:color w:val="000000" w:themeColor="text1"/>
-          <w:sz w:val="24"/>
-          <w:szCs w:val="24"/>
-        </w:rPr>
-        <w:t>Plan de Pruebas:</w:t>
-      </w:r>
-      <w:r>
-        <w:rPr>
-          <w:rFonts w:ascii="Arial" w:hAnsi="Arial" w:cs="Arial"/>
-          <w:color w:val="000000" w:themeColor="text1"/>
-          <w:sz w:val="24"/>
-          <w:szCs w:val="24"/>
-        </w:rPr>
-        <w:br/>
-        <w:t>Descripción del plan de pruebas, incluyendo tipos de pruebas que se realizarán (unitarias, de integración, de sistema, etc.)</w:t>
+        <w:pStyle w:val="Ttulo1"/>
+        <w:rPr>
+          <w:rFonts w:ascii="Arial" w:hAnsi="Arial" w:cs="Arial"/>
+          <w:b w:val="0"/>
+          <w:bCs w:val="0"/>
+          <w:color w:val="000000" w:themeColor="text1"/>
+          <w:sz w:val="24"/>
+          <w:szCs w:val="24"/>
+          <w:lang w:val="es-ES"/>
+        </w:rPr>
+      </w:pPr>
+      <w:r>
+        <w:rPr>
+          <w:rFonts w:ascii="Arial" w:hAnsi="Arial" w:cs="Arial"/>
+          <w:b w:val="0"/>
+          <w:bCs w:val="0"/>
+          <w:color w:val="000000" w:themeColor="text1"/>
+          <w:sz w:val="24"/>
+          <w:szCs w:val="24"/>
+          <w:lang w:val="es-ES"/>
+        </w:rPr>
+        <w:t>Plan de Pruebas</w:t>
       </w:r>
     </w:p>
     <w:p>
       <w:pPr>
-        <w:rPr>
-          <w:rFonts w:ascii="Arial" w:hAnsi="Arial" w:cs="Arial"/>
-          <w:color w:val="000000" w:themeColor="text1"/>
-          <w:sz w:val="24"/>
-          <w:szCs w:val="24"/>
-        </w:rPr>
-      </w:pPr>
-      <w:r>
-        <w:rPr>
-          <w:rFonts w:ascii="Arial" w:hAnsi="Arial" w:cs="Arial"/>
-          <w:color w:val="000000" w:themeColor="text1"/>
-          <w:sz w:val="24"/>
-          <w:szCs w:val="24"/>
-        </w:rPr>
-        <w:t>Casos de Prueba:</w:t>
-      </w:r>
-      <w:r>
-        <w:rPr>
-          <w:rFonts w:ascii="Arial" w:hAnsi="Arial" w:cs="Arial"/>
-          <w:color w:val="000000" w:themeColor="text1"/>
-          <w:sz w:val="24"/>
-          <w:szCs w:val="24"/>
-        </w:rPr>
-        <w:br/>
-        <w:t>Lista de casos de prueba específicos para validar las funcionalidades del sistema.</w:t>
+        <w:pStyle w:val="Ttulo1"/>
+        <w:rPr>
+          <w:rFonts w:ascii="Arial" w:hAnsi="Arial" w:cs="Arial"/>
+          <w:b w:val="0"/>
+          <w:bCs w:val="0"/>
+          <w:color w:val="000000" w:themeColor="text1"/>
+          <w:sz w:val="24"/>
+          <w:szCs w:val="24"/>
+          <w:lang w:val="es-ES"/>
+        </w:rPr>
+      </w:pPr>
+      <w:r>
+        <w:rPr>
+          <w:rFonts w:ascii="Arial" w:hAnsi="Arial" w:cs="Arial"/>
+          <w:b w:val="0"/>
+          <w:bCs w:val="0"/>
+          <w:color w:val="000000" w:themeColor="text1"/>
+          <w:sz w:val="24"/>
+          <w:szCs w:val="24"/>
+          <w:lang w:val="es-ES"/>
+        </w:rPr>
+        <w:t>El plan de pruebas contempla tres niveles para asegurar la robustez de la aplicación:</w:t>
       </w:r>
     </w:p>
     <w:p>
       <w:pPr>
         <w:pStyle w:val="Ttulo1"/>
-        <w:rPr>
-          <w:rFonts w:ascii="Arial" w:hAnsi="Arial" w:cs="Arial"/>
-          <w:b w:val="0"/>
-          <w:bCs w:val="0"/>
-          <w:color w:val="000000" w:themeColor="text1"/>
-          <w:sz w:val="24"/>
-          <w:szCs w:val="24"/>
-        </w:rPr>
-      </w:pPr>
-      <w:r>
-        <w:rPr>
-          <w:rFonts w:ascii="Arial" w:hAnsi="Arial" w:cs="Arial"/>
-          <w:b w:val="0"/>
-          <w:bCs w:val="0"/>
-          <w:color w:val="000000" w:themeColor="text1"/>
-          <w:sz w:val="24"/>
-          <w:szCs w:val="24"/>
-        </w:rPr>
-        <w:lastRenderedPageBreak/>
-        <w:t>10. Gestión del Proyecto</w:t>
+        <w:numPr>
+          <w:ilvl w:val="0"/>
+          <w:numId w:val="20"/>
+        </w:numPr>
+        <w:rPr>
+          <w:rFonts w:ascii="Arial" w:hAnsi="Arial" w:cs="Arial"/>
+          <w:b w:val="0"/>
+          <w:bCs w:val="0"/>
+          <w:color w:val="000000" w:themeColor="text1"/>
+          <w:sz w:val="24"/>
+          <w:szCs w:val="24"/>
+          <w:lang w:val="es-ES"/>
+        </w:rPr>
+      </w:pPr>
+      <w:r>
+        <w:rPr>
+          <w:rFonts w:ascii="Arial" w:hAnsi="Arial" w:cs="Arial"/>
+          <w:b w:val="0"/>
+          <w:bCs w:val="0"/>
+          <w:color w:val="000000" w:themeColor="text1"/>
+          <w:sz w:val="24"/>
+          <w:szCs w:val="24"/>
+          <w:lang w:val="es-ES"/>
+        </w:rPr>
+        <w:t>Pruebas Unitarias (</w:t>
+      </w:r>
+      <w:proofErr w:type="spellStart"/>
+      <w:r>
+        <w:rPr>
+          <w:rFonts w:ascii="Arial" w:hAnsi="Arial" w:cs="Arial"/>
+          <w:b w:val="0"/>
+          <w:bCs w:val="0"/>
+          <w:color w:val="000000" w:themeColor="text1"/>
+          <w:sz w:val="24"/>
+          <w:szCs w:val="24"/>
+          <w:lang w:val="es-ES"/>
+        </w:rPr>
+        <w:t>Unit</w:t>
+      </w:r>
+      <w:proofErr w:type="spellEnd"/>
+      <w:r>
+        <w:rPr>
+          <w:rFonts w:ascii="Arial" w:hAnsi="Arial" w:cs="Arial"/>
+          <w:b w:val="0"/>
+          <w:bCs w:val="0"/>
+          <w:color w:val="000000" w:themeColor="text1"/>
+          <w:sz w:val="24"/>
+          <w:szCs w:val="24"/>
+          <w:lang w:val="es-ES"/>
+        </w:rPr>
+        <w:t xml:space="preserve"> </w:t>
+      </w:r>
+      <w:proofErr w:type="spellStart"/>
+      <w:r>
+        <w:rPr>
+          <w:rFonts w:ascii="Arial" w:hAnsi="Arial" w:cs="Arial"/>
+          <w:b w:val="0"/>
+          <w:bCs w:val="0"/>
+          <w:color w:val="000000" w:themeColor="text1"/>
+          <w:sz w:val="24"/>
+          <w:szCs w:val="24"/>
+          <w:lang w:val="es-ES"/>
+        </w:rPr>
+        <w:t>Testing</w:t>
+      </w:r>
+      <w:proofErr w:type="spellEnd"/>
+      <w:r>
+        <w:rPr>
+          <w:rFonts w:ascii="Arial" w:hAnsi="Arial" w:cs="Arial"/>
+          <w:b w:val="0"/>
+          <w:bCs w:val="0"/>
+          <w:color w:val="000000" w:themeColor="text1"/>
+          <w:sz w:val="24"/>
+          <w:szCs w:val="24"/>
+          <w:lang w:val="es-ES"/>
+        </w:rPr>
+        <w:t xml:space="preserve">): Verificación de la lógica de negocio en los </w:t>
+      </w:r>
+      <w:proofErr w:type="spellStart"/>
+      <w:r>
+        <w:rPr>
+          <w:rFonts w:ascii="Arial" w:hAnsi="Arial" w:cs="Arial"/>
+          <w:b w:val="0"/>
+          <w:bCs w:val="0"/>
+          <w:color w:val="000000" w:themeColor="text1"/>
+          <w:sz w:val="24"/>
+          <w:szCs w:val="24"/>
+          <w:lang w:val="es-ES"/>
+        </w:rPr>
+        <w:t>ViewModels</w:t>
+      </w:r>
+      <w:proofErr w:type="spellEnd"/>
+      <w:r>
+        <w:rPr>
+          <w:rFonts w:ascii="Arial" w:hAnsi="Arial" w:cs="Arial"/>
+          <w:b w:val="0"/>
+          <w:bCs w:val="0"/>
+          <w:color w:val="000000" w:themeColor="text1"/>
+          <w:sz w:val="24"/>
+          <w:szCs w:val="24"/>
+          <w:lang w:val="es-ES"/>
+        </w:rPr>
+        <w:t xml:space="preserve"> y transformaciones de datos en los Repositorios (ej. cálculo de duración de sesiones).</w:t>
       </w:r>
     </w:p>
     <w:p>
       <w:pPr>
+        <w:pStyle w:val="Ttulo1"/>
+        <w:numPr>
+          <w:ilvl w:val="0"/>
+          <w:numId w:val="20"/>
+        </w:numPr>
+        <w:rPr>
+          <w:rFonts w:ascii="Arial" w:hAnsi="Arial" w:cs="Arial"/>
+          <w:b w:val="0"/>
+          <w:bCs w:val="0"/>
+          <w:color w:val="000000" w:themeColor="text1"/>
+          <w:sz w:val="24"/>
+          <w:szCs w:val="24"/>
+          <w:lang w:val="es-ES"/>
+        </w:rPr>
+      </w:pPr>
+      <w:r>
+        <w:rPr>
+          <w:rFonts w:ascii="Arial" w:hAnsi="Arial" w:cs="Arial"/>
+          <w:b w:val="0"/>
+          <w:bCs w:val="0"/>
+          <w:color w:val="000000" w:themeColor="text1"/>
+          <w:sz w:val="24"/>
+          <w:szCs w:val="24"/>
+          <w:lang w:val="es-ES"/>
+        </w:rPr>
+        <w:lastRenderedPageBreak/>
+        <w:t xml:space="preserve">Pruebas de Integración: Validación de la comunicación entre la </w:t>
+      </w:r>
+      <w:proofErr w:type="gramStart"/>
+      <w:r>
+        <w:rPr>
+          <w:rFonts w:ascii="Arial" w:hAnsi="Arial" w:cs="Arial"/>
+          <w:b w:val="0"/>
+          <w:bCs w:val="0"/>
+          <w:color w:val="000000" w:themeColor="text1"/>
+          <w:sz w:val="24"/>
+          <w:szCs w:val="24"/>
+          <w:lang w:val="es-ES"/>
+        </w:rPr>
+        <w:t>app</w:t>
+      </w:r>
+      <w:proofErr w:type="gramEnd"/>
+      <w:r>
+        <w:rPr>
+          <w:rFonts w:ascii="Arial" w:hAnsi="Arial" w:cs="Arial"/>
+          <w:b w:val="0"/>
+          <w:bCs w:val="0"/>
+          <w:color w:val="000000" w:themeColor="text1"/>
+          <w:sz w:val="24"/>
+          <w:szCs w:val="24"/>
+          <w:lang w:val="es-ES"/>
+        </w:rPr>
+        <w:t xml:space="preserve"> y la API de </w:t>
+      </w:r>
+      <w:proofErr w:type="spellStart"/>
+      <w:r>
+        <w:rPr>
+          <w:rFonts w:ascii="Arial" w:hAnsi="Arial" w:cs="Arial"/>
+          <w:b w:val="0"/>
+          <w:bCs w:val="0"/>
+          <w:color w:val="000000" w:themeColor="text1"/>
+          <w:sz w:val="24"/>
+          <w:szCs w:val="24"/>
+          <w:lang w:val="es-ES"/>
+        </w:rPr>
+        <w:t>Supabase</w:t>
+      </w:r>
+      <w:proofErr w:type="spellEnd"/>
+      <w:r>
+        <w:rPr>
+          <w:rFonts w:ascii="Arial" w:hAnsi="Arial" w:cs="Arial"/>
+          <w:b w:val="0"/>
+          <w:bCs w:val="0"/>
+          <w:color w:val="000000" w:themeColor="text1"/>
+          <w:sz w:val="24"/>
+          <w:szCs w:val="24"/>
+          <w:lang w:val="es-ES"/>
+        </w:rPr>
+        <w:t xml:space="preserve">, asegurando que el registro, </w:t>
+      </w:r>
+      <w:proofErr w:type="spellStart"/>
+      <w:r>
+        <w:rPr>
+          <w:rFonts w:ascii="Arial" w:hAnsi="Arial" w:cs="Arial"/>
+          <w:b w:val="0"/>
+          <w:bCs w:val="0"/>
+          <w:color w:val="000000" w:themeColor="text1"/>
+          <w:sz w:val="24"/>
+          <w:szCs w:val="24"/>
+          <w:lang w:val="es-ES"/>
+        </w:rPr>
+        <w:t>login</w:t>
+      </w:r>
+      <w:proofErr w:type="spellEnd"/>
+      <w:r>
+        <w:rPr>
+          <w:rFonts w:ascii="Arial" w:hAnsi="Arial" w:cs="Arial"/>
+          <w:b w:val="0"/>
+          <w:bCs w:val="0"/>
+          <w:color w:val="000000" w:themeColor="text1"/>
+          <w:sz w:val="24"/>
+          <w:szCs w:val="24"/>
+          <w:lang w:val="es-ES"/>
+        </w:rPr>
+        <w:t xml:space="preserve"> y sincronización de datos funcionen con latencia real.</w:t>
+      </w:r>
+    </w:p>
+    <w:p>
+      <w:pPr>
+        <w:pStyle w:val="Ttulo1"/>
+        <w:numPr>
+          <w:ilvl w:val="0"/>
+          <w:numId w:val="20"/>
+        </w:numPr>
+        <w:rPr>
+          <w:rFonts w:ascii="Arial" w:hAnsi="Arial" w:cs="Arial"/>
+          <w:b w:val="0"/>
+          <w:bCs w:val="0"/>
+          <w:color w:val="000000" w:themeColor="text1"/>
+          <w:sz w:val="24"/>
+          <w:szCs w:val="24"/>
+          <w:lang w:val="es-ES"/>
+        </w:rPr>
+      </w:pPr>
+      <w:r>
+        <w:rPr>
+          <w:rFonts w:ascii="Arial" w:hAnsi="Arial" w:cs="Arial"/>
+          <w:b w:val="0"/>
+          <w:bCs w:val="0"/>
+          <w:color w:val="000000" w:themeColor="text1"/>
+          <w:sz w:val="24"/>
+          <w:szCs w:val="24"/>
+          <w:lang w:val="es-ES"/>
+        </w:rPr>
+        <w:t xml:space="preserve">Pruebas de Sistema (Manuales): Navegación completa por la </w:t>
+      </w:r>
+      <w:proofErr w:type="gramStart"/>
+      <w:r>
+        <w:rPr>
+          <w:rFonts w:ascii="Arial" w:hAnsi="Arial" w:cs="Arial"/>
+          <w:b w:val="0"/>
+          <w:bCs w:val="0"/>
+          <w:color w:val="000000" w:themeColor="text1"/>
+          <w:sz w:val="24"/>
+          <w:szCs w:val="24"/>
+          <w:lang w:val="es-ES"/>
+        </w:rPr>
+        <w:t>app</w:t>
+      </w:r>
+      <w:proofErr w:type="gramEnd"/>
+      <w:r>
+        <w:rPr>
+          <w:rFonts w:ascii="Arial" w:hAnsi="Arial" w:cs="Arial"/>
+          <w:b w:val="0"/>
+          <w:bCs w:val="0"/>
+          <w:color w:val="000000" w:themeColor="text1"/>
+          <w:sz w:val="24"/>
+          <w:szCs w:val="24"/>
+          <w:lang w:val="es-ES"/>
+        </w:rPr>
+        <w:t xml:space="preserve"> (End-</w:t>
+      </w:r>
+      <w:proofErr w:type="spellStart"/>
+      <w:r>
+        <w:rPr>
+          <w:rFonts w:ascii="Arial" w:hAnsi="Arial" w:cs="Arial"/>
+          <w:b w:val="0"/>
+          <w:bCs w:val="0"/>
+          <w:color w:val="000000" w:themeColor="text1"/>
+          <w:sz w:val="24"/>
+          <w:szCs w:val="24"/>
+          <w:lang w:val="es-ES"/>
+        </w:rPr>
+        <w:t>to</w:t>
+      </w:r>
+      <w:proofErr w:type="spellEnd"/>
+      <w:r>
+        <w:rPr>
+          <w:rFonts w:ascii="Arial" w:hAnsi="Arial" w:cs="Arial"/>
+          <w:b w:val="0"/>
+          <w:bCs w:val="0"/>
+          <w:color w:val="000000" w:themeColor="text1"/>
+          <w:sz w:val="24"/>
+          <w:szCs w:val="24"/>
+          <w:lang w:val="es-ES"/>
+        </w:rPr>
+        <w:t>-End) en dispositivos físicos para validar la experiencia de usuario y el funcionamiento de permisos críticos como </w:t>
+      </w:r>
+    </w:p>
+    <w:p>
+      <w:pPr>
+        <w:pStyle w:val="Ttulo1"/>
+        <w:rPr>
+          <w:rFonts w:ascii="Arial" w:hAnsi="Arial" w:cs="Arial"/>
+          <w:b w:val="0"/>
+          <w:bCs w:val="0"/>
+          <w:color w:val="000000" w:themeColor="text1"/>
+          <w:sz w:val="24"/>
+          <w:szCs w:val="24"/>
+          <w:lang w:val="es-ES"/>
+        </w:rPr>
+      </w:pPr>
+    </w:p>
+    <w:p>
+      <w:pPr>
+        <w:pStyle w:val="Ttulo1"/>
+        <w:rPr>
+          <w:rFonts w:ascii="Arial" w:hAnsi="Arial" w:cs="Arial"/>
+          <w:b w:val="0"/>
+          <w:bCs w:val="0"/>
+          <w:color w:val="000000" w:themeColor="text1"/>
+          <w:sz w:val="24"/>
+          <w:szCs w:val="24"/>
+        </w:rPr>
+      </w:pPr>
+      <w:r>
+        <w:rPr>
+          <w:rFonts w:ascii="Arial" w:hAnsi="Arial" w:cs="Arial"/>
+          <w:b w:val="0"/>
+          <w:bCs w:val="0"/>
+          <w:color w:val="000000" w:themeColor="text1"/>
+          <w:sz w:val="24"/>
+          <w:szCs w:val="24"/>
+        </w:rPr>
+        <w:t>Gestión del Proyecto</w:t>
+      </w:r>
+    </w:p>
+    <w:p>
+      <w:pPr>
         <w:rPr>
           <w:rFonts w:ascii="Arial" w:hAnsi="Arial" w:cs="Arial"/>
           <w:color w:val="000000" w:themeColor="text1"/>
@@ -5235,108 +5538,137 @@
           <w:color w:val="000000" w:themeColor="text1"/>
           <w:sz w:val="24"/>
           <w:szCs w:val="24"/>
-        </w:rPr>
-      </w:pPr>
-      <w:r>
-        <w:rPr>
-          <w:rFonts w:ascii="Arial" w:hAnsi="Arial" w:cs="Arial"/>
-          <w:color w:val="000000" w:themeColor="text1"/>
-          <w:sz w:val="24"/>
-          <w:szCs w:val="24"/>
-        </w:rPr>
-        <w:t>Recursos:</w:t>
-      </w:r>
-      <w:r>
-        <w:rPr>
-          <w:rFonts w:ascii="Arial" w:hAnsi="Arial" w:cs="Arial"/>
-          <w:color w:val="000000" w:themeColor="text1"/>
-          <w:sz w:val="24"/>
-          <w:szCs w:val="24"/>
-        </w:rPr>
-        <w:br/>
-        <w:t>Descripción de los recursos necesarios para el proyecto, incluyendo hardware, software y personal.</w:t>
+          <w:lang w:val="es-ES"/>
+        </w:rPr>
+      </w:pPr>
+      <w:r>
+        <w:rPr>
+          <w:rFonts w:ascii="Arial" w:hAnsi="Arial" w:cs="Arial"/>
+          <w:color w:val="000000" w:themeColor="text1"/>
+          <w:sz w:val="24"/>
+          <w:szCs w:val="24"/>
+          <w:lang w:val="es-ES"/>
+        </w:rPr>
+        <w:t>Recursos</w:t>
       </w:r>
     </w:p>
     <w:p>
       <w:pPr>
-        <w:rPr>
-          <w:rFonts w:ascii="Arial" w:hAnsi="Arial" w:cs="Arial"/>
-          <w:color w:val="000000" w:themeColor="text1"/>
-          <w:sz w:val="24"/>
-          <w:szCs w:val="24"/>
-        </w:rPr>
-      </w:pPr>
-      <w:r>
-        <w:rPr>
-          <w:rFonts w:ascii="Arial" w:hAnsi="Arial" w:cs="Arial"/>
-          <w:color w:val="000000" w:themeColor="text1"/>
-          <w:sz w:val="24"/>
-          <w:szCs w:val="24"/>
-        </w:rPr>
-        <w:t>Riesgos y Mitigación:</w:t>
-      </w:r>
-      <w:r>
-        <w:rPr>
-          <w:rFonts w:ascii="Arial" w:hAnsi="Arial" w:cs="Arial"/>
-          <w:color w:val="000000" w:themeColor="text1"/>
-          <w:sz w:val="24"/>
-          <w:szCs w:val="24"/>
-        </w:rPr>
-        <w:br/>
-        <w:t>Identificación de posibles riesgos del proyecto y estrategias para mitigarlos.</w:t>
+        <w:numPr>
+          <w:ilvl w:val="0"/>
+          <w:numId w:val="21"/>
+        </w:numPr>
+        <w:rPr>
+          <w:rFonts w:ascii="Arial" w:hAnsi="Arial" w:cs="Arial"/>
+          <w:color w:val="000000" w:themeColor="text1"/>
+          <w:sz w:val="24"/>
+          <w:szCs w:val="24"/>
+          <w:lang w:val="es-ES"/>
+        </w:rPr>
+      </w:pPr>
+      <w:r>
+        <w:rPr>
+          <w:rFonts w:ascii="Arial" w:hAnsi="Arial" w:cs="Arial"/>
+          <w:color w:val="000000" w:themeColor="text1"/>
+          <w:sz w:val="24"/>
+          <w:szCs w:val="24"/>
+          <w:lang w:val="es-ES"/>
+        </w:rPr>
+        <w:t>Hardware: Laptops para desarrollo (Windows/Mac), Dispositivos Android para pruebas (físicos y emuladores).</w:t>
       </w:r>
     </w:p>
     <w:p>
       <w:pPr>
-        <w:pStyle w:val="Ttulo1"/>
-        <w:rPr>
-          <w:rFonts w:ascii="Arial" w:hAnsi="Arial" w:cs="Arial"/>
-          <w:b w:val="0"/>
-          <w:bCs w:val="0"/>
-          <w:color w:val="000000" w:themeColor="text1"/>
-          <w:sz w:val="24"/>
-          <w:szCs w:val="24"/>
-        </w:rPr>
-      </w:pPr>
-      <w:r>
-        <w:rPr>
-          <w:rFonts w:ascii="Arial" w:hAnsi="Arial" w:cs="Arial"/>
-          <w:b w:val="0"/>
-          <w:bCs w:val="0"/>
-          <w:color w:val="000000" w:themeColor="text1"/>
-          <w:sz w:val="24"/>
-          <w:szCs w:val="24"/>
-        </w:rPr>
-        <w:t>11. Mapa de Procesos</w:t>
+        <w:numPr>
+          <w:ilvl w:val="0"/>
+          <w:numId w:val="21"/>
+        </w:numPr>
+        <w:rPr>
+          <w:rFonts w:ascii="Arial" w:hAnsi="Arial" w:cs="Arial"/>
+          <w:color w:val="000000" w:themeColor="text1"/>
+          <w:sz w:val="24"/>
+          <w:szCs w:val="24"/>
+          <w:lang w:val="es-ES"/>
+        </w:rPr>
+      </w:pPr>
+      <w:r>
+        <w:rPr>
+          <w:rFonts w:ascii="Arial" w:hAnsi="Arial" w:cs="Arial"/>
+          <w:color w:val="000000" w:themeColor="text1"/>
+          <w:sz w:val="24"/>
+          <w:szCs w:val="24"/>
+          <w:lang w:val="es-ES"/>
+        </w:rPr>
+        <w:t xml:space="preserve">Software: Android Studio </w:t>
+      </w:r>
+      <w:proofErr w:type="spellStart"/>
+      <w:r>
+        <w:rPr>
+          <w:rFonts w:ascii="Arial" w:hAnsi="Arial" w:cs="Arial"/>
+          <w:color w:val="000000" w:themeColor="text1"/>
+          <w:sz w:val="24"/>
+          <w:szCs w:val="24"/>
+          <w:lang w:val="es-ES"/>
+        </w:rPr>
+        <w:t>Ladybug</w:t>
+      </w:r>
+      <w:proofErr w:type="spellEnd"/>
+      <w:r>
+        <w:rPr>
+          <w:rFonts w:ascii="Arial" w:hAnsi="Arial" w:cs="Arial"/>
+          <w:color w:val="000000" w:themeColor="text1"/>
+          <w:sz w:val="24"/>
+          <w:szCs w:val="24"/>
+          <w:lang w:val="es-ES"/>
+        </w:rPr>
+        <w:t>, Git/GitHub, Postman (pruebas API).</w:t>
       </w:r>
     </w:p>
     <w:p>
       <w:pPr>
-        <w:rPr>
-          <w:rFonts w:ascii="Arial" w:hAnsi="Arial" w:cs="Arial"/>
-          <w:color w:val="000000" w:themeColor="text1"/>
-          <w:sz w:val="24"/>
-          <w:szCs w:val="24"/>
-        </w:rPr>
-      </w:pPr>
-      <w:r>
-        <w:rPr>
-          <w:rFonts w:ascii="Arial" w:hAnsi="Arial" w:cs="Arial"/>
-          <w:color w:val="000000" w:themeColor="text1"/>
-          <w:sz w:val="24"/>
-          <w:szCs w:val="24"/>
-        </w:rPr>
-        <w:t>Mapa de Procesos:</w:t>
-      </w:r>
-      <w:r>
-        <w:rPr>
-          <w:rFonts w:ascii="Arial" w:hAnsi="Arial" w:cs="Arial"/>
-          <w:color w:val="000000" w:themeColor="text1"/>
-          <w:sz w:val="24"/>
-          <w:szCs w:val="24"/>
-        </w:rPr>
-        <w:br/>
-        <w:t>Descripción detallada de los procesos involucrados y un diagrama que ilustre la secuencia y la interacción entre ellos.</w:t>
+        <w:numPr>
+          <w:ilvl w:val="0"/>
+          <w:numId w:val="21"/>
+        </w:numPr>
+        <w:rPr>
+          <w:rFonts w:ascii="Arial" w:hAnsi="Arial" w:cs="Arial"/>
+          <w:color w:val="000000" w:themeColor="text1"/>
+          <w:sz w:val="24"/>
+          <w:szCs w:val="24"/>
+          <w:lang w:val="es-ES"/>
+        </w:rPr>
+      </w:pPr>
+      <w:r>
+        <w:rPr>
+          <w:rFonts w:ascii="Arial" w:hAnsi="Arial" w:cs="Arial"/>
+          <w:color w:val="000000" w:themeColor="text1"/>
+          <w:sz w:val="24"/>
+          <w:szCs w:val="24"/>
+          <w:lang w:val="es-ES"/>
+        </w:rPr>
+        <w:t>Servicios Cloud: </w:t>
+      </w:r>
+      <w:proofErr w:type="spellStart"/>
+      <w:r>
+        <w:rPr>
+          <w:rFonts w:ascii="Arial" w:hAnsi="Arial" w:cs="Arial"/>
+          <w:color w:val="000000" w:themeColor="text1"/>
+          <w:sz w:val="24"/>
+          <w:szCs w:val="24"/>
+          <w:lang w:val="es-ES"/>
+        </w:rPr>
+        <w:t>Supabase</w:t>
+      </w:r>
+      <w:proofErr w:type="spellEnd"/>
+      <w:r>
+        <w:rPr>
+          <w:rFonts w:ascii="Arial" w:hAnsi="Arial" w:cs="Arial"/>
+          <w:color w:val="000000" w:themeColor="text1"/>
+          <w:sz w:val="24"/>
+          <w:szCs w:val="24"/>
+          <w:lang w:val="es-ES"/>
+        </w:rPr>
+        <w:t xml:space="preserve"> (Tier gratuito) para base de datos y Auth.</w:t>
       </w:r>
     </w:p>
     <w:p>
@@ -5349,119 +5681,195 @@
           <w:color w:val="000000" w:themeColor="text1"/>
           <w:sz w:val="24"/>
           <w:szCs w:val="24"/>
-        </w:rPr>
-      </w:pPr>
-      <w:r>
-        <w:rPr>
-          <w:rFonts w:ascii="Arial" w:hAnsi="Arial" w:cs="Arial"/>
-          <w:b w:val="0"/>
-          <w:bCs w:val="0"/>
-          <w:color w:val="000000" w:themeColor="text1"/>
-          <w:sz w:val="24"/>
-          <w:szCs w:val="24"/>
-        </w:rPr>
-        <w:t>12. Conclusiones</w:t>
+          <w:lang w:val="es-ES"/>
+        </w:rPr>
+      </w:pPr>
+      <w:r>
+        <w:rPr>
+          <w:rFonts w:ascii="Arial" w:hAnsi="Arial" w:cs="Arial"/>
+          <w:b w:val="0"/>
+          <w:bCs w:val="0"/>
+          <w:color w:val="000000" w:themeColor="text1"/>
+          <w:sz w:val="24"/>
+          <w:szCs w:val="24"/>
+          <w:lang w:val="es-ES"/>
+        </w:rPr>
+        <w:lastRenderedPageBreak/>
+        <w:t>Riesgos y Mitigación</w:t>
       </w:r>
     </w:p>
     <w:p>
       <w:pPr>
-        <w:rPr>
-          <w:rFonts w:ascii="Arial" w:hAnsi="Arial" w:cs="Arial"/>
-          <w:color w:val="000000" w:themeColor="text1"/>
-          <w:sz w:val="24"/>
-          <w:szCs w:val="24"/>
-        </w:rPr>
-      </w:pPr>
-      <w:r>
-        <w:rPr>
-          <w:rFonts w:ascii="Arial" w:hAnsi="Arial" w:cs="Arial"/>
-          <w:color w:val="000000" w:themeColor="text1"/>
-          <w:sz w:val="24"/>
-          <w:szCs w:val="24"/>
-        </w:rPr>
-        <w:t>Resumen:</w:t>
-      </w:r>
-      <w:r>
-        <w:rPr>
-          <w:rFonts w:ascii="Arial" w:hAnsi="Arial" w:cs="Arial"/>
-          <w:color w:val="000000" w:themeColor="text1"/>
-          <w:sz w:val="24"/>
-          <w:szCs w:val="24"/>
-        </w:rPr>
-        <w:br/>
-        <w:t>Resumen de los principales puntos y logros del proyecto.</w:t>
+        <w:pStyle w:val="Ttulo1"/>
+        <w:numPr>
+          <w:ilvl w:val="0"/>
+          <w:numId w:val="22"/>
+        </w:numPr>
+        <w:rPr>
+          <w:rFonts w:ascii="Arial" w:hAnsi="Arial" w:cs="Arial"/>
+          <w:b w:val="0"/>
+          <w:bCs w:val="0"/>
+          <w:color w:val="000000" w:themeColor="text1"/>
+          <w:sz w:val="24"/>
+          <w:szCs w:val="24"/>
+          <w:lang w:val="es-ES"/>
+        </w:rPr>
+      </w:pPr>
+      <w:r>
+        <w:rPr>
+          <w:rFonts w:ascii="Arial" w:hAnsi="Arial" w:cs="Arial"/>
+          <w:b w:val="0"/>
+          <w:bCs w:val="0"/>
+          <w:color w:val="000000" w:themeColor="text1"/>
+          <w:sz w:val="24"/>
+          <w:szCs w:val="24"/>
+          <w:lang w:val="es-ES"/>
+        </w:rPr>
+        <w:t>Riesgo: Cambios en políticas de Google Play sobre permisos de monitoreo.</w:t>
       </w:r>
     </w:p>
     <w:p>
       <w:pPr>
-        <w:rPr>
-          <w:rFonts w:ascii="Arial" w:hAnsi="Arial" w:cs="Arial"/>
-          <w:color w:val="000000" w:themeColor="text1"/>
-          <w:sz w:val="24"/>
-          <w:szCs w:val="24"/>
-        </w:rPr>
-      </w:pPr>
-      <w:r>
-        <w:rPr>
-          <w:rFonts w:ascii="Arial" w:hAnsi="Arial" w:cs="Arial"/>
-          <w:color w:val="000000" w:themeColor="text1"/>
-          <w:sz w:val="24"/>
-          <w:szCs w:val="24"/>
-        </w:rPr>
-        <w:t>Trabajo Futuro:</w:t>
-      </w:r>
-      <w:r>
-        <w:rPr>
-          <w:rFonts w:ascii="Arial" w:hAnsi="Arial" w:cs="Arial"/>
-          <w:color w:val="000000" w:themeColor="text1"/>
-          <w:sz w:val="24"/>
-          <w:szCs w:val="24"/>
-        </w:rPr>
-        <w:br/>
-        <w:t>Recomendaciones para futuras mejoras o desarrollos adicionales.</w:t>
+        <w:pStyle w:val="Ttulo1"/>
+        <w:numPr>
+          <w:ilvl w:val="1"/>
+          <w:numId w:val="22"/>
+        </w:numPr>
+        <w:rPr>
+          <w:rFonts w:ascii="Arial" w:hAnsi="Arial" w:cs="Arial"/>
+          <w:b w:val="0"/>
+          <w:bCs w:val="0"/>
+          <w:color w:val="000000" w:themeColor="text1"/>
+          <w:sz w:val="24"/>
+          <w:szCs w:val="24"/>
+          <w:lang w:val="es-ES"/>
+        </w:rPr>
+      </w:pPr>
+      <w:r>
+        <w:rPr>
+          <w:rFonts w:ascii="Arial" w:hAnsi="Arial" w:cs="Arial"/>
+          <w:b w:val="0"/>
+          <w:bCs w:val="0"/>
+          <w:i/>
+          <w:iCs/>
+          <w:color w:val="000000" w:themeColor="text1"/>
+          <w:sz w:val="24"/>
+          <w:szCs w:val="24"/>
+          <w:lang w:val="es-ES"/>
+        </w:rPr>
+        <w:t>Mitigación:</w:t>
+      </w:r>
+      <w:r>
+        <w:rPr>
+          <w:rFonts w:ascii="Arial" w:hAnsi="Arial" w:cs="Arial"/>
+          <w:b w:val="0"/>
+          <w:bCs w:val="0"/>
+          <w:color w:val="000000" w:themeColor="text1"/>
+          <w:sz w:val="24"/>
+          <w:szCs w:val="24"/>
+          <w:lang w:val="es-ES"/>
+        </w:rPr>
+        <w:t> Mantenerse actualizado con la documentación de desarrollad y usar permisos solo cuando sea estrictamente necesario.</w:t>
       </w:r>
     </w:p>
     <w:p>
       <w:pPr>
         <w:pStyle w:val="Ttulo1"/>
-        <w:rPr>
-          <w:rFonts w:ascii="Arial" w:hAnsi="Arial" w:cs="Arial"/>
-          <w:b w:val="0"/>
-          <w:bCs w:val="0"/>
-          <w:color w:val="000000" w:themeColor="text1"/>
-          <w:sz w:val="24"/>
-          <w:szCs w:val="24"/>
-        </w:rPr>
-      </w:pPr>
-      <w:r>
-        <w:rPr>
-          <w:rFonts w:ascii="Arial" w:hAnsi="Arial" w:cs="Arial"/>
-          <w:b w:val="0"/>
-          <w:bCs w:val="0"/>
-          <w:color w:val="000000" w:themeColor="text1"/>
-          <w:sz w:val="24"/>
-          <w:szCs w:val="24"/>
-        </w:rPr>
-        <w:t>13. Referencias</w:t>
+        <w:numPr>
+          <w:ilvl w:val="0"/>
+          <w:numId w:val="22"/>
+        </w:numPr>
+        <w:rPr>
+          <w:rFonts w:ascii="Arial" w:hAnsi="Arial" w:cs="Arial"/>
+          <w:b w:val="0"/>
+          <w:bCs w:val="0"/>
+          <w:color w:val="000000" w:themeColor="text1"/>
+          <w:sz w:val="24"/>
+          <w:szCs w:val="24"/>
+          <w:lang w:val="es-ES"/>
+        </w:rPr>
+      </w:pPr>
+      <w:r>
+        <w:rPr>
+          <w:rFonts w:ascii="Arial" w:hAnsi="Arial" w:cs="Arial"/>
+          <w:b w:val="0"/>
+          <w:bCs w:val="0"/>
+          <w:color w:val="000000" w:themeColor="text1"/>
+          <w:sz w:val="24"/>
+          <w:szCs w:val="24"/>
+          <w:lang w:val="es-ES"/>
+        </w:rPr>
+        <w:t>Riesgo: Fallos en la conexión a internet para sincronización.</w:t>
       </w:r>
     </w:p>
     <w:p>
       <w:pPr>
-        <w:rPr>
-          <w:rFonts w:ascii="Arial" w:hAnsi="Arial" w:cs="Arial"/>
-          <w:color w:val="000000" w:themeColor="text1"/>
-          <w:sz w:val="24"/>
-          <w:szCs w:val="24"/>
-        </w:rPr>
-      </w:pPr>
-      <w:r>
-        <w:rPr>
-          <w:rFonts w:ascii="Arial" w:hAnsi="Arial" w:cs="Arial"/>
-          <w:color w:val="000000" w:themeColor="text1"/>
-          <w:sz w:val="24"/>
-          <w:szCs w:val="24"/>
-        </w:rPr>
-        <w:t>Listado de todas las fuentes y referencias utilizadas durante el desarrollo del proyecto.</w:t>
+        <w:pStyle w:val="Ttulo1"/>
+        <w:numPr>
+          <w:ilvl w:val="1"/>
+          <w:numId w:val="22"/>
+        </w:numPr>
+        <w:rPr>
+          <w:rFonts w:ascii="Arial" w:hAnsi="Arial" w:cs="Arial"/>
+          <w:b w:val="0"/>
+          <w:bCs w:val="0"/>
+          <w:color w:val="000000" w:themeColor="text1"/>
+          <w:sz w:val="24"/>
+          <w:szCs w:val="24"/>
+          <w:lang w:val="es-ES"/>
+        </w:rPr>
+      </w:pPr>
+      <w:r>
+        <w:rPr>
+          <w:rFonts w:ascii="Arial" w:hAnsi="Arial" w:cs="Arial"/>
+          <w:b w:val="0"/>
+          <w:bCs w:val="0"/>
+          <w:i/>
+          <w:iCs/>
+          <w:color w:val="000000" w:themeColor="text1"/>
+          <w:sz w:val="24"/>
+          <w:szCs w:val="24"/>
+          <w:lang w:val="es-ES"/>
+        </w:rPr>
+        <w:t>Mitigación:</w:t>
+      </w:r>
+      <w:r>
+        <w:rPr>
+          <w:rFonts w:ascii="Arial" w:hAnsi="Arial" w:cs="Arial"/>
+          <w:b w:val="0"/>
+          <w:bCs w:val="0"/>
+          <w:color w:val="000000" w:themeColor="text1"/>
+          <w:sz w:val="24"/>
+          <w:szCs w:val="24"/>
+          <w:lang w:val="es-ES"/>
+        </w:rPr>
+        <w:t> Implementar base de datos local (Room) para funcionamiento offline y sincronización diferida (</w:t>
+      </w:r>
+      <w:proofErr w:type="spellStart"/>
+      <w:r>
+        <w:rPr>
+          <w:rFonts w:ascii="Arial" w:hAnsi="Arial" w:cs="Arial"/>
+          <w:b w:val="0"/>
+          <w:bCs w:val="0"/>
+          <w:color w:val="000000" w:themeColor="text1"/>
+          <w:sz w:val="24"/>
+          <w:szCs w:val="24"/>
+          <w:lang w:val="es-ES"/>
+        </w:rPr>
+        <w:t>WorkManager</w:t>
+      </w:r>
+      <w:proofErr w:type="spellEnd"/>
+      <w:r>
+        <w:rPr>
+          <w:rFonts w:ascii="Arial" w:hAnsi="Arial" w:cs="Arial"/>
+          <w:b w:val="0"/>
+          <w:bCs w:val="0"/>
+          <w:color w:val="000000" w:themeColor="text1"/>
+          <w:sz w:val="24"/>
+          <w:szCs w:val="24"/>
+          <w:lang w:val="es-ES"/>
+        </w:rPr>
+        <w:t>).</w:t>
       </w:r>
     </w:p>
     <w:p>
@@ -5474,48 +5882,277 @@
           <w:color w:val="000000" w:themeColor="text1"/>
           <w:sz w:val="24"/>
           <w:szCs w:val="24"/>
-        </w:rPr>
-      </w:pPr>
-      <w:r>
-        <w:rPr>
-          <w:rFonts w:ascii="Arial" w:hAnsi="Arial" w:cs="Arial"/>
-          <w:b w:val="0"/>
-          <w:bCs w:val="0"/>
-          <w:color w:val="000000" w:themeColor="text1"/>
-          <w:sz w:val="24"/>
-          <w:szCs w:val="24"/>
-        </w:rPr>
-        <w:t>14. Anexos</w:t>
+          <w:lang w:val="es-ES"/>
+        </w:rPr>
+      </w:pPr>
+      <w:r>
+        <w:rPr>
+          <w:rFonts w:ascii="Arial" w:hAnsi="Arial" w:cs="Arial"/>
+          <w:b w:val="0"/>
+          <w:bCs w:val="0"/>
+          <w:color w:val="000000" w:themeColor="text1"/>
+          <w:sz w:val="24"/>
+          <w:szCs w:val="24"/>
+          <w:lang w:val="es-ES"/>
+        </w:rPr>
+        <w:t>Conclusiones</w:t>
       </w:r>
     </w:p>
     <w:p>
       <w:pPr>
-        <w:rPr>
-          <w:rFonts w:ascii="Arial" w:hAnsi="Arial" w:cs="Arial"/>
-          <w:color w:val="000000" w:themeColor="text1"/>
-          <w:sz w:val="24"/>
-          <w:szCs w:val="24"/>
-        </w:rPr>
-      </w:pPr>
-      <w:r>
-        <w:rPr>
-          <w:rFonts w:ascii="Arial" w:hAnsi="Arial" w:cs="Arial"/>
-          <w:color w:val="000000" w:themeColor="text1"/>
-          <w:sz w:val="24"/>
-          <w:szCs w:val="24"/>
-        </w:rPr>
-        <w:t>Documentación Adicional:</w:t>
-      </w:r>
-      <w:r>
-        <w:rPr>
-          <w:rFonts w:ascii="Arial" w:hAnsi="Arial" w:cs="Arial"/>
-          <w:color w:val="000000" w:themeColor="text1"/>
-          <w:sz w:val="24"/>
-          <w:szCs w:val="24"/>
-        </w:rPr>
-        <w:br/>
-        <w:t>Cualquier documentación adicional relevante para el proyecto, como códigos fuente, manuales de usuario, etc.</w:t>
-      </w:r>
+        <w:pStyle w:val="Ttulo1"/>
+        <w:rPr>
+          <w:rFonts w:ascii="Arial" w:hAnsi="Arial" w:cs="Arial"/>
+          <w:b w:val="0"/>
+          <w:bCs w:val="0"/>
+          <w:color w:val="000000" w:themeColor="text1"/>
+          <w:sz w:val="24"/>
+          <w:szCs w:val="24"/>
+          <w:lang w:val="es-ES"/>
+        </w:rPr>
+      </w:pPr>
+      <w:r>
+        <w:rPr>
+          <w:rFonts w:ascii="Arial" w:hAnsi="Arial" w:cs="Arial"/>
+          <w:b w:val="0"/>
+          <w:bCs w:val="0"/>
+          <w:color w:val="000000" w:themeColor="text1"/>
+          <w:sz w:val="24"/>
+          <w:szCs w:val="24"/>
+          <w:lang w:val="es-ES"/>
+        </w:rPr>
+        <w:t>Resumen: El proyecto Rest Cycle ha logrado integrar exitosamente tecnologías modernas de desarrollo móvil (</w:t>
+      </w:r>
+      <w:proofErr w:type="spellStart"/>
+      <w:r>
+        <w:rPr>
+          <w:rFonts w:ascii="Arial" w:hAnsi="Arial" w:cs="Arial"/>
+          <w:b w:val="0"/>
+          <w:bCs w:val="0"/>
+          <w:color w:val="000000" w:themeColor="text1"/>
+          <w:sz w:val="24"/>
+          <w:szCs w:val="24"/>
+          <w:lang w:val="es-ES"/>
+        </w:rPr>
+        <w:t>Jetpack</w:t>
+      </w:r>
+      <w:proofErr w:type="spellEnd"/>
+      <w:r>
+        <w:rPr>
+          <w:rFonts w:ascii="Arial" w:hAnsi="Arial" w:cs="Arial"/>
+          <w:b w:val="0"/>
+          <w:bCs w:val="0"/>
+          <w:color w:val="000000" w:themeColor="text1"/>
+          <w:sz w:val="24"/>
+          <w:szCs w:val="24"/>
+          <w:lang w:val="es-ES"/>
+        </w:rPr>
+        <w:t xml:space="preserve"> </w:t>
+      </w:r>
+      <w:proofErr w:type="spellStart"/>
+      <w:r>
+        <w:rPr>
+          <w:rFonts w:ascii="Arial" w:hAnsi="Arial" w:cs="Arial"/>
+          <w:b w:val="0"/>
+          <w:bCs w:val="0"/>
+          <w:color w:val="000000" w:themeColor="text1"/>
+          <w:sz w:val="24"/>
+          <w:szCs w:val="24"/>
+          <w:lang w:val="es-ES"/>
+        </w:rPr>
+        <w:t>Compose</w:t>
+      </w:r>
+      <w:proofErr w:type="spellEnd"/>
+      <w:r>
+        <w:rPr>
+          <w:rFonts w:ascii="Arial" w:hAnsi="Arial" w:cs="Arial"/>
+          <w:b w:val="0"/>
+          <w:bCs w:val="0"/>
+          <w:color w:val="000000" w:themeColor="text1"/>
+          <w:sz w:val="24"/>
+          <w:szCs w:val="24"/>
+          <w:lang w:val="es-ES"/>
+        </w:rPr>
+        <w:t>, Kotlin) con una infraestructura backend robusta (</w:t>
+      </w:r>
+      <w:proofErr w:type="spellStart"/>
+      <w:r>
+        <w:rPr>
+          <w:rFonts w:ascii="Arial" w:hAnsi="Arial" w:cs="Arial"/>
+          <w:b w:val="0"/>
+          <w:bCs w:val="0"/>
+          <w:color w:val="000000" w:themeColor="text1"/>
+          <w:sz w:val="24"/>
+          <w:szCs w:val="24"/>
+          <w:lang w:val="es-ES"/>
+        </w:rPr>
+        <w:t>Supabase</w:t>
+      </w:r>
+      <w:proofErr w:type="spellEnd"/>
+      <w:r>
+        <w:rPr>
+          <w:rFonts w:ascii="Arial" w:hAnsi="Arial" w:cs="Arial"/>
+          <w:b w:val="0"/>
+          <w:bCs w:val="0"/>
+          <w:color w:val="000000" w:themeColor="text1"/>
+          <w:sz w:val="24"/>
+          <w:szCs w:val="24"/>
+          <w:lang w:val="es-ES"/>
+        </w:rPr>
+        <w:t>). Se ha cumplido con los objetivos clave de autenticación segura, visualización de estadísticas detalladas y una interfaz de usuario intuitiva y estética. La implementación de la arquitectura MVVM asegura que el proyecto es mantenible y escalable para futuras fases.</w:t>
+      </w:r>
+    </w:p>
+    <w:p>
+      <w:pPr>
+        <w:pStyle w:val="Ttulo1"/>
+        <w:rPr>
+          <w:rFonts w:ascii="Arial" w:hAnsi="Arial" w:cs="Arial"/>
+          <w:b w:val="0"/>
+          <w:bCs w:val="0"/>
+          <w:color w:val="000000" w:themeColor="text1"/>
+          <w:sz w:val="24"/>
+          <w:szCs w:val="24"/>
+          <w:lang w:val="es-ES"/>
+        </w:rPr>
+      </w:pPr>
+      <w:r>
+        <w:rPr>
+          <w:rFonts w:ascii="Arial" w:hAnsi="Arial" w:cs="Arial"/>
+          <w:b w:val="0"/>
+          <w:bCs w:val="0"/>
+          <w:color w:val="000000" w:themeColor="text1"/>
+          <w:sz w:val="24"/>
+          <w:szCs w:val="24"/>
+          <w:lang w:val="es-ES"/>
+        </w:rPr>
+        <w:t>Trabajo Futuro:</w:t>
+      </w:r>
+    </w:p>
+    <w:p>
+      <w:pPr>
+        <w:pStyle w:val="Ttulo1"/>
+        <w:numPr>
+          <w:ilvl w:val="0"/>
+          <w:numId w:val="23"/>
+        </w:numPr>
+        <w:rPr>
+          <w:rFonts w:ascii="Arial" w:hAnsi="Arial" w:cs="Arial"/>
+          <w:b w:val="0"/>
+          <w:bCs w:val="0"/>
+          <w:color w:val="000000" w:themeColor="text1"/>
+          <w:sz w:val="24"/>
+          <w:szCs w:val="24"/>
+          <w:lang w:val="es-ES"/>
+        </w:rPr>
+      </w:pPr>
+      <w:r>
+        <w:rPr>
+          <w:rFonts w:ascii="Arial" w:hAnsi="Arial" w:cs="Arial"/>
+          <w:b w:val="0"/>
+          <w:bCs w:val="0"/>
+          <w:color w:val="000000" w:themeColor="text1"/>
+          <w:sz w:val="24"/>
+          <w:szCs w:val="24"/>
+          <w:lang w:val="es-ES"/>
+        </w:rPr>
+        <w:t>Implementar un </w:t>
+      </w:r>
+      <w:proofErr w:type="spellStart"/>
+      <w:r>
+        <w:rPr>
+          <w:rFonts w:ascii="Arial" w:hAnsi="Arial" w:cs="Arial"/>
+          <w:b w:val="0"/>
+          <w:bCs w:val="0"/>
+          <w:color w:val="000000" w:themeColor="text1"/>
+          <w:sz w:val="24"/>
+          <w:szCs w:val="24"/>
+          <w:lang w:val="es-ES"/>
+        </w:rPr>
+        <w:t>Dashboard</w:t>
+      </w:r>
+      <w:proofErr w:type="spellEnd"/>
+      <w:r>
+        <w:rPr>
+          <w:rFonts w:ascii="Arial" w:hAnsi="Arial" w:cs="Arial"/>
+          <w:b w:val="0"/>
+          <w:bCs w:val="0"/>
+          <w:color w:val="000000" w:themeColor="text1"/>
+          <w:sz w:val="24"/>
+          <w:szCs w:val="24"/>
+          <w:lang w:val="es-ES"/>
+        </w:rPr>
+        <w:t xml:space="preserve"> Web para que los padres puedan gestionar cuentas desde el PC.</w:t>
+      </w:r>
+    </w:p>
+    <w:p>
+      <w:pPr>
+        <w:pStyle w:val="Ttulo1"/>
+        <w:numPr>
+          <w:ilvl w:val="0"/>
+          <w:numId w:val="23"/>
+        </w:numPr>
+        <w:rPr>
+          <w:rFonts w:ascii="Arial" w:hAnsi="Arial" w:cs="Arial"/>
+          <w:b w:val="0"/>
+          <w:bCs w:val="0"/>
+          <w:color w:val="000000" w:themeColor="text1"/>
+          <w:sz w:val="24"/>
+          <w:szCs w:val="24"/>
+          <w:lang w:val="es-ES"/>
+        </w:rPr>
+      </w:pPr>
+      <w:r>
+        <w:rPr>
+          <w:rFonts w:ascii="Arial" w:hAnsi="Arial" w:cs="Arial"/>
+          <w:b w:val="0"/>
+          <w:bCs w:val="0"/>
+          <w:color w:val="000000" w:themeColor="text1"/>
+          <w:sz w:val="24"/>
+          <w:szCs w:val="24"/>
+          <w:lang w:val="es-ES"/>
+        </w:rPr>
+        <w:t>Mejorar la persistencia offline utilizando Room Database para garantizar que no se pierdan datos de uso si no hay internet.</w:t>
+      </w:r>
+    </w:p>
+    <w:p>
+      <w:pPr>
+        <w:pStyle w:val="Ttulo1"/>
+        <w:numPr>
+          <w:ilvl w:val="0"/>
+          <w:numId w:val="23"/>
+        </w:numPr>
+        <w:rPr>
+          <w:rFonts w:ascii="Arial" w:hAnsi="Arial" w:cs="Arial"/>
+          <w:b w:val="0"/>
+          <w:bCs w:val="0"/>
+          <w:color w:val="000000" w:themeColor="text1"/>
+          <w:sz w:val="24"/>
+          <w:szCs w:val="24"/>
+          <w:lang w:val="es-ES"/>
+        </w:rPr>
+      </w:pPr>
+      <w:r>
+        <w:rPr>
+          <w:rFonts w:ascii="Arial" w:hAnsi="Arial" w:cs="Arial"/>
+          <w:b w:val="0"/>
+          <w:bCs w:val="0"/>
+          <w:color w:val="000000" w:themeColor="text1"/>
+          <w:sz w:val="24"/>
+          <w:szCs w:val="24"/>
+          <w:lang w:val="es-ES"/>
+        </w:rPr>
+        <w:t>Integrar Inteligencia Artificial para analizar patrones de comportamiento y sugerir descansos personalizados.</w:t>
+      </w:r>
+    </w:p>
+    <w:p>
+      <w:pPr>
+        <w:rPr>
+          <w:rFonts w:ascii="Arial" w:hAnsi="Arial" w:cs="Arial"/>
+          <w:color w:val="000000" w:themeColor="text1"/>
+          <w:sz w:val="24"/>
+          <w:szCs w:val="24"/>
+        </w:rPr>
+      </w:pPr>
     </w:p>
     <w:sectPr>
       <w:pgSz w:w="12240" w:h="15840"/>
@@ -5701,6 +6338,417 @@
     </w:lvl>
   </w:abstractNum>
   <w:abstractNum w:abstractNumId="9" w15:restartNumberingAfterBreak="0">
+    <w:nsid w:val="0F380C10"/>
+    <w:multiLevelType w:val="multilevel"/>
+    <w:tmpl w:val="CC32215C"/>
+    <w:lvl w:ilvl="0">
+      <w:start w:val="1"/>
+      <w:numFmt w:val="decimal"/>
+      <w:lvlText w:val="%1."/>
+      <w:lvlJc w:val="left"/>
+      <w:pPr>
+        <w:tabs>
+          <w:tab w:val="num" w:pos="720"/>
+        </w:tabs>
+        <w:ind w:left="720" w:hanging="360"/>
+      </w:pPr>
+    </w:lvl>
+    <w:lvl w:ilvl="1" w:tentative="1">
+      <w:start w:val="1"/>
+      <w:numFmt w:val="decimal"/>
+      <w:lvlText w:val="%2."/>
+      <w:lvlJc w:val="left"/>
+      <w:pPr>
+        <w:tabs>
+          <w:tab w:val="num" w:pos="1440"/>
+        </w:tabs>
+        <w:ind w:left="1440" w:hanging="360"/>
+      </w:pPr>
+    </w:lvl>
+    <w:lvl w:ilvl="2" w:tentative="1">
+      <w:start w:val="1"/>
+      <w:numFmt w:val="decimal"/>
+      <w:lvlText w:val="%3."/>
+      <w:lvlJc w:val="left"/>
+      <w:pPr>
+        <w:tabs>
+          <w:tab w:val="num" w:pos="2160"/>
+        </w:tabs>
+        <w:ind w:left="2160" w:hanging="360"/>
+      </w:pPr>
+    </w:lvl>
+    <w:lvl w:ilvl="3" w:tentative="1">
+      <w:start w:val="1"/>
+      <w:numFmt w:val="decimal"/>
+      <w:lvlText w:val="%4."/>
+      <w:lvlJc w:val="left"/>
+      <w:pPr>
+        <w:tabs>
+          <w:tab w:val="num" w:pos="2880"/>
+        </w:tabs>
+        <w:ind w:left="2880" w:hanging="360"/>
+      </w:pPr>
+    </w:lvl>
+    <w:lvl w:ilvl="4" w:tentative="1">
+      <w:start w:val="1"/>
+      <w:numFmt w:val="decimal"/>
+      <w:lvlText w:val="%5."/>
+      <w:lvlJc w:val="left"/>
+      <w:pPr>
+        <w:tabs>
+          <w:tab w:val="num" w:pos="3600"/>
+        </w:tabs>
+        <w:ind w:left="3600" w:hanging="360"/>
+      </w:pPr>
+    </w:lvl>
+    <w:lvl w:ilvl="5" w:tentative="1">
+      <w:start w:val="1"/>
+      <w:numFmt w:val="decimal"/>
+      <w:lvlText w:val="%6."/>
+      <w:lvlJc w:val="left"/>
+      <w:pPr>
+        <w:tabs>
+          <w:tab w:val="num" w:pos="4320"/>
+        </w:tabs>
+        <w:ind w:left="4320" w:hanging="360"/>
+      </w:pPr>
+    </w:lvl>
+    <w:lvl w:ilvl="6" w:tentative="1">
+      <w:start w:val="1"/>
+      <w:numFmt w:val="decimal"/>
+      <w:lvlText w:val="%7."/>
+      <w:lvlJc w:val="left"/>
+      <w:pPr>
+        <w:tabs>
+          <w:tab w:val="num" w:pos="5040"/>
+        </w:tabs>
+        <w:ind w:left="5040" w:hanging="360"/>
+      </w:pPr>
+    </w:lvl>
+    <w:lvl w:ilvl="7" w:tentative="1">
+      <w:start w:val="1"/>
+      <w:numFmt w:val="decimal"/>
+      <w:lvlText w:val="%8."/>
+      <w:lvlJc w:val="left"/>
+      <w:pPr>
+        <w:tabs>
+          <w:tab w:val="num" w:pos="5760"/>
+        </w:tabs>
+        <w:ind w:left="5760" w:hanging="360"/>
+      </w:pPr>
+    </w:lvl>
+    <w:lvl w:ilvl="8" w:tentative="1">
+      <w:start w:val="1"/>
+      <w:numFmt w:val="decimal"/>
+      <w:lvlText w:val="%9."/>
+      <w:lvlJc w:val="left"/>
+      <w:pPr>
+        <w:tabs>
+          <w:tab w:val="num" w:pos="6480"/>
+        </w:tabs>
+        <w:ind w:left="6480" w:hanging="360"/>
+      </w:pPr>
+    </w:lvl>
+  </w:abstractNum>
+  <w:abstractNum w:abstractNumId="10" w15:restartNumberingAfterBreak="0">
+    <w:nsid w:val="0F8C2CEE"/>
+    <w:multiLevelType w:val="multilevel"/>
+    <w:tmpl w:val="AEF0B774"/>
+    <w:lvl w:ilvl="0">
+      <w:start w:val="1"/>
+      <w:numFmt w:val="bullet"/>
+      <w:lvlText w:val=""/>
+      <w:lvlJc w:val="left"/>
+      <w:pPr>
+        <w:tabs>
+          <w:tab w:val="num" w:pos="720"/>
+        </w:tabs>
+        <w:ind w:left="720" w:hanging="360"/>
+      </w:pPr>
+      <w:rPr>
+        <w:rFonts w:ascii="Symbol" w:hAnsi="Symbol" w:hint="default"/>
+        <w:sz w:val="20"/>
+      </w:rPr>
+    </w:lvl>
+    <w:lvl w:ilvl="1">
+      <w:start w:val="1"/>
+      <w:numFmt w:val="bullet"/>
+      <w:lvlText w:val=""/>
+      <w:lvlJc w:val="left"/>
+      <w:pPr>
+        <w:tabs>
+          <w:tab w:val="num" w:pos="1440"/>
+        </w:tabs>
+        <w:ind w:left="1440" w:hanging="360"/>
+      </w:pPr>
+      <w:rPr>
+        <w:rFonts w:ascii="Symbol" w:hAnsi="Symbol" w:hint="default"/>
+        <w:sz w:val="20"/>
+      </w:rPr>
+    </w:lvl>
+    <w:lvl w:ilvl="2" w:tentative="1">
+      <w:start w:val="1"/>
+      <w:numFmt w:val="bullet"/>
+      <w:lvlText w:val=""/>
+      <w:lvlJc w:val="left"/>
+      <w:pPr>
+        <w:tabs>
+          <w:tab w:val="num" w:pos="2160"/>
+        </w:tabs>
+        <w:ind w:left="2160" w:hanging="360"/>
+      </w:pPr>
+      <w:rPr>
+        <w:rFonts w:ascii="Symbol" w:hAnsi="Symbol" w:hint="default"/>
+        <w:sz w:val="20"/>
+      </w:rPr>
+    </w:lvl>
+    <w:lvl w:ilvl="3" w:tentative="1">
+      <w:start w:val="1"/>
+      <w:numFmt w:val="bullet"/>
+      <w:lvlText w:val=""/>
+      <w:lvlJc w:val="left"/>
+      <w:pPr>
+        <w:tabs>
+          <w:tab w:val="num" w:pos="2880"/>
+        </w:tabs>
+        <w:ind w:left="2880" w:hanging="360"/>
+      </w:pPr>
+      <w:rPr>
+        <w:rFonts w:ascii="Symbol" w:hAnsi="Symbol" w:hint="default"/>
+        <w:sz w:val="20"/>
+      </w:rPr>
+    </w:lvl>
+    <w:lvl w:ilvl="4" w:tentative="1">
+      <w:start w:val="1"/>
+      <w:numFmt w:val="bullet"/>
+      <w:lvlText w:val=""/>
+      <w:lvlJc w:val="left"/>
+      <w:pPr>
+        <w:tabs>
+          <w:tab w:val="num" w:pos="3600"/>
+        </w:tabs>
+        <w:ind w:left="3600" w:hanging="360"/>
+      </w:pPr>
+      <w:rPr>
+        <w:rFonts w:ascii="Symbol" w:hAnsi="Symbol" w:hint="default"/>
+        <w:sz w:val="20"/>
+      </w:rPr>
+    </w:lvl>
+    <w:lvl w:ilvl="5" w:tentative="1">
+      <w:start w:val="1"/>
+      <w:numFmt w:val="bullet"/>
+      <w:lvlText w:val=""/>
+      <w:lvlJc w:val="left"/>
+      <w:pPr>
+        <w:tabs>
+          <w:tab w:val="num" w:pos="4320"/>
+        </w:tabs>
+        <w:ind w:left="4320" w:hanging="360"/>
+      </w:pPr>
+      <w:rPr>
+        <w:rFonts w:ascii="Symbol" w:hAnsi="Symbol" w:hint="default"/>
+        <w:sz w:val="20"/>
+      </w:rPr>
+    </w:lvl>
+    <w:lvl w:ilvl="6" w:tentative="1">
+      <w:start w:val="1"/>
+      <w:numFmt w:val="bullet"/>
+      <w:lvlText w:val=""/>
+      <w:lvlJc w:val="left"/>
+      <w:pPr>
+        <w:tabs>
+          <w:tab w:val="num" w:pos="5040"/>
+        </w:tabs>
+        <w:ind w:left="5040" w:hanging="360"/>
+      </w:pPr>
+      <w:rPr>
+        <w:rFonts w:ascii="Symbol" w:hAnsi="Symbol" w:hint="default"/>
+        <w:sz w:val="20"/>
+      </w:rPr>
+    </w:lvl>
+    <w:lvl w:ilvl="7" w:tentative="1">
+      <w:start w:val="1"/>
+      <w:numFmt w:val="bullet"/>
+      <w:lvlText w:val=""/>
+      <w:lvlJc w:val="left"/>
+      <w:pPr>
+        <w:tabs>
+          <w:tab w:val="num" w:pos="5760"/>
+        </w:tabs>
+        <w:ind w:left="5760" w:hanging="360"/>
+      </w:pPr>
+      <w:rPr>
+        <w:rFonts w:ascii="Symbol" w:hAnsi="Symbol" w:hint="default"/>
+        <w:sz w:val="20"/>
+      </w:rPr>
+    </w:lvl>
+    <w:lvl w:ilvl="8" w:tentative="1">
+      <w:start w:val="1"/>
+      <w:numFmt w:val="bullet"/>
+      <w:lvlText w:val=""/>
+      <w:lvlJc w:val="left"/>
+      <w:pPr>
+        <w:tabs>
+          <w:tab w:val="num" w:pos="6480"/>
+        </w:tabs>
+        <w:ind w:left="6480" w:hanging="360"/>
+      </w:pPr>
+      <w:rPr>
+        <w:rFonts w:ascii="Symbol" w:hAnsi="Symbol" w:hint="default"/>
+        <w:sz w:val="20"/>
+      </w:rPr>
+    </w:lvl>
+  </w:abstractNum>
+  <w:abstractNum w:abstractNumId="11" w15:restartNumberingAfterBreak="0">
+    <w:nsid w:val="163F1D20"/>
+    <w:multiLevelType w:val="multilevel"/>
+    <w:tmpl w:val="FCE81E94"/>
+    <w:lvl w:ilvl="0">
+      <w:start w:val="1"/>
+      <w:numFmt w:val="bullet"/>
+      <w:lvlText w:val=""/>
+      <w:lvlJc w:val="left"/>
+      <w:pPr>
+        <w:tabs>
+          <w:tab w:val="num" w:pos="720"/>
+        </w:tabs>
+        <w:ind w:left="720" w:hanging="360"/>
+      </w:pPr>
+      <w:rPr>
+        <w:rFonts w:ascii="Symbol" w:hAnsi="Symbol" w:hint="default"/>
+        <w:sz w:val="20"/>
+      </w:rPr>
+    </w:lvl>
+    <w:lvl w:ilvl="1" w:tentative="1">
+      <w:start w:val="1"/>
+      <w:numFmt w:val="bullet"/>
+      <w:lvlText w:val=""/>
+      <w:lvlJc w:val="left"/>
+      <w:pPr>
+        <w:tabs>
+          <w:tab w:val="num" w:pos="1440"/>
+        </w:tabs>
+        <w:ind w:left="1440" w:hanging="360"/>
+      </w:pPr>
+      <w:rPr>
+        <w:rFonts w:ascii="Symbol" w:hAnsi="Symbol" w:hint="default"/>
+        <w:sz w:val="20"/>
+      </w:rPr>
+    </w:lvl>
+    <w:lvl w:ilvl="2" w:tentative="1">
+      <w:start w:val="1"/>
+      <w:numFmt w:val="bullet"/>
+      <w:lvlText w:val=""/>
+      <w:lvlJc w:val="left"/>
+      <w:pPr>
+        <w:tabs>
+          <w:tab w:val="num" w:pos="2160"/>
+        </w:tabs>
+        <w:ind w:left="2160" w:hanging="360"/>
+      </w:pPr>
+      <w:rPr>
+        <w:rFonts w:ascii="Symbol" w:hAnsi="Symbol" w:hint="default"/>
+        <w:sz w:val="20"/>
+      </w:rPr>
+    </w:lvl>
+    <w:lvl w:ilvl="3" w:tentative="1">
+      <w:start w:val="1"/>
+      <w:numFmt w:val="bullet"/>
+      <w:lvlText w:val=""/>
+      <w:lvlJc w:val="left"/>
+      <w:pPr>
+        <w:tabs>
+          <w:tab w:val="num" w:pos="2880"/>
+        </w:tabs>
+        <w:ind w:left="2880" w:hanging="360"/>
+      </w:pPr>
+      <w:rPr>
+        <w:rFonts w:ascii="Symbol" w:hAnsi="Symbol" w:hint="default"/>
+        <w:sz w:val="20"/>
+      </w:rPr>
+    </w:lvl>
+    <w:lvl w:ilvl="4" w:tentative="1">
+      <w:start w:val="1"/>
+      <w:numFmt w:val="bullet"/>
+      <w:lvlText w:val=""/>
+      <w:lvlJc w:val="left"/>
+      <w:pPr>
+        <w:tabs>
+          <w:tab w:val="num" w:pos="3600"/>
+        </w:tabs>
+        <w:ind w:left="3600" w:hanging="360"/>
+      </w:pPr>
+      <w:rPr>
+        <w:rFonts w:ascii="Symbol" w:hAnsi="Symbol" w:hint="default"/>
+        <w:sz w:val="20"/>
+      </w:rPr>
+    </w:lvl>
+    <w:lvl w:ilvl="5" w:tentative="1">
+      <w:start w:val="1"/>
+      <w:numFmt w:val="bullet"/>
+      <w:lvlText w:val=""/>
+      <w:lvlJc w:val="left"/>
+      <w:pPr>
+        <w:tabs>
+          <w:tab w:val="num" w:pos="4320"/>
+        </w:tabs>
+        <w:ind w:left="4320" w:hanging="360"/>
+      </w:pPr>
+      <w:rPr>
+        <w:rFonts w:ascii="Symbol" w:hAnsi="Symbol" w:hint="default"/>
+        <w:sz w:val="20"/>
+      </w:rPr>
+    </w:lvl>
+    <w:lvl w:ilvl="6" w:tentative="1">
+      <w:start w:val="1"/>
+      <w:numFmt w:val="bullet"/>
+      <w:lvlText w:val=""/>
+      <w:lvlJc w:val="left"/>
+      <w:pPr>
+        <w:tabs>
+          <w:tab w:val="num" w:pos="5040"/>
+        </w:tabs>
+        <w:ind w:left="5040" w:hanging="360"/>
+      </w:pPr>
+      <w:rPr>
+        <w:rFonts w:ascii="Symbol" w:hAnsi="Symbol" w:hint="default"/>
+        <w:sz w:val="20"/>
+      </w:rPr>
+    </w:lvl>
+    <w:lvl w:ilvl="7" w:tentative="1">
+      <w:start w:val="1"/>
+      <w:numFmt w:val="bullet"/>
+      <w:lvlText w:val=""/>
+      <w:lvlJc w:val="left"/>
+      <w:pPr>
+        <w:tabs>
+          <w:tab w:val="num" w:pos="5760"/>
+        </w:tabs>
+        <w:ind w:left="5760" w:hanging="360"/>
+      </w:pPr>
+      <w:rPr>
+        <w:rFonts w:ascii="Symbol" w:hAnsi="Symbol" w:hint="default"/>
+        <w:sz w:val="20"/>
+      </w:rPr>
+    </w:lvl>
+    <w:lvl w:ilvl="8" w:tentative="1">
+      <w:start w:val="1"/>
+      <w:numFmt w:val="bullet"/>
+      <w:lvlText w:val=""/>
+      <w:lvlJc w:val="left"/>
+      <w:pPr>
+        <w:tabs>
+          <w:tab w:val="num" w:pos="6480"/>
+        </w:tabs>
+        <w:ind w:left="6480" w:hanging="360"/>
+      </w:pPr>
+      <w:rPr>
+        <w:rFonts w:ascii="Symbol" w:hAnsi="Symbol" w:hint="default"/>
+        <w:sz w:val="20"/>
+      </w:rPr>
+    </w:lvl>
+  </w:abstractNum>
+  <w:abstractNum w:abstractNumId="12" w15:restartNumberingAfterBreak="0">
     <w:nsid w:val="192E3EFF"/>
     <w:multiLevelType w:val="multilevel"/>
     <w:tmpl w:val="1198390C"/>
@@ -5849,7 +6897,7 @@
       </w:rPr>
     </w:lvl>
   </w:abstractNum>
-  <w:abstractNum w:abstractNumId="10" w15:restartNumberingAfterBreak="0">
+  <w:abstractNum w:abstractNumId="13" w15:restartNumberingAfterBreak="0">
     <w:nsid w:val="2DE728F8"/>
     <w:multiLevelType w:val="multilevel"/>
     <w:tmpl w:val="CC3EF8F6"/>
@@ -5998,7 +7046,7 @@
       </w:rPr>
     </w:lvl>
   </w:abstractNum>
-  <w:abstractNum w:abstractNumId="11" w15:restartNumberingAfterBreak="0">
+  <w:abstractNum w:abstractNumId="14" w15:restartNumberingAfterBreak="0">
     <w:nsid w:val="30C65F08"/>
     <w:multiLevelType w:val="multilevel"/>
     <w:tmpl w:val="FD16CF58"/>
@@ -6147,7 +7195,7 @@
       </w:rPr>
     </w:lvl>
   </w:abstractNum>
-  <w:abstractNum w:abstractNumId="12" w15:restartNumberingAfterBreak="0">
+  <w:abstractNum w:abstractNumId="15" w15:restartNumberingAfterBreak="0">
     <w:nsid w:val="3624527C"/>
     <w:multiLevelType w:val="multilevel"/>
     <w:tmpl w:val="2F14707C"/>
@@ -6296,7 +7344,7 @@
       </w:rPr>
     </w:lvl>
   </w:abstractNum>
-  <w:abstractNum w:abstractNumId="13" w15:restartNumberingAfterBreak="0">
+  <w:abstractNum w:abstractNumId="16" w15:restartNumberingAfterBreak="0">
     <w:nsid w:val="41F05BA1"/>
     <w:multiLevelType w:val="multilevel"/>
     <w:tmpl w:val="E32225D8"/>
@@ -6445,7 +7493,156 @@
       </w:rPr>
     </w:lvl>
   </w:abstractNum>
-  <w:abstractNum w:abstractNumId="14" w15:restartNumberingAfterBreak="0">
+  <w:abstractNum w:abstractNumId="17" w15:restartNumberingAfterBreak="0">
+    <w:nsid w:val="44D610A3"/>
+    <w:multiLevelType w:val="multilevel"/>
+    <w:tmpl w:val="03567DC8"/>
+    <w:lvl w:ilvl="0">
+      <w:start w:val="1"/>
+      <w:numFmt w:val="bullet"/>
+      <w:lvlText w:val=""/>
+      <w:lvlJc w:val="left"/>
+      <w:pPr>
+        <w:tabs>
+          <w:tab w:val="num" w:pos="720"/>
+        </w:tabs>
+        <w:ind w:left="720" w:hanging="360"/>
+      </w:pPr>
+      <w:rPr>
+        <w:rFonts w:ascii="Symbol" w:hAnsi="Symbol" w:hint="default"/>
+        <w:sz w:val="20"/>
+      </w:rPr>
+    </w:lvl>
+    <w:lvl w:ilvl="1" w:tentative="1">
+      <w:start w:val="1"/>
+      <w:numFmt w:val="bullet"/>
+      <w:lvlText w:val=""/>
+      <w:lvlJc w:val="left"/>
+      <w:pPr>
+        <w:tabs>
+          <w:tab w:val="num" w:pos="1440"/>
+        </w:tabs>
+        <w:ind w:left="1440" w:hanging="360"/>
+      </w:pPr>
+      <w:rPr>
+        <w:rFonts w:ascii="Symbol" w:hAnsi="Symbol" w:hint="default"/>
+        <w:sz w:val="20"/>
+      </w:rPr>
+    </w:lvl>
+    <w:lvl w:ilvl="2" w:tentative="1">
+      <w:start w:val="1"/>
+      <w:numFmt w:val="bullet"/>
+      <w:lvlText w:val=""/>
+      <w:lvlJc w:val="left"/>
+      <w:pPr>
+        <w:tabs>
+          <w:tab w:val="num" w:pos="2160"/>
+        </w:tabs>
+        <w:ind w:left="2160" w:hanging="360"/>
+      </w:pPr>
+      <w:rPr>
+        <w:rFonts w:ascii="Symbol" w:hAnsi="Symbol" w:hint="default"/>
+        <w:sz w:val="20"/>
+      </w:rPr>
+    </w:lvl>
+    <w:lvl w:ilvl="3" w:tentative="1">
+      <w:start w:val="1"/>
+      <w:numFmt w:val="bullet"/>
+      <w:lvlText w:val=""/>
+      <w:lvlJc w:val="left"/>
+      <w:pPr>
+        <w:tabs>
+          <w:tab w:val="num" w:pos="2880"/>
+        </w:tabs>
+        <w:ind w:left="2880" w:hanging="360"/>
+      </w:pPr>
+      <w:rPr>
+        <w:rFonts w:ascii="Symbol" w:hAnsi="Symbol" w:hint="default"/>
+        <w:sz w:val="20"/>
+      </w:rPr>
+    </w:lvl>
+    <w:lvl w:ilvl="4" w:tentative="1">
+      <w:start w:val="1"/>
+      <w:numFmt w:val="bullet"/>
+      <w:lvlText w:val=""/>
+      <w:lvlJc w:val="left"/>
+      <w:pPr>
+        <w:tabs>
+          <w:tab w:val="num" w:pos="3600"/>
+        </w:tabs>
+        <w:ind w:left="3600" w:hanging="360"/>
+      </w:pPr>
+      <w:rPr>
+        <w:rFonts w:ascii="Symbol" w:hAnsi="Symbol" w:hint="default"/>
+        <w:sz w:val="20"/>
+      </w:rPr>
+    </w:lvl>
+    <w:lvl w:ilvl="5" w:tentative="1">
+      <w:start w:val="1"/>
+      <w:numFmt w:val="bullet"/>
+      <w:lvlText w:val=""/>
+      <w:lvlJc w:val="left"/>
+      <w:pPr>
+        <w:tabs>
+          <w:tab w:val="num" w:pos="4320"/>
+        </w:tabs>
+        <w:ind w:left="4320" w:hanging="360"/>
+      </w:pPr>
+      <w:rPr>
+        <w:rFonts w:ascii="Symbol" w:hAnsi="Symbol" w:hint="default"/>
+        <w:sz w:val="20"/>
+      </w:rPr>
+    </w:lvl>
+    <w:lvl w:ilvl="6" w:tentative="1">
+      <w:start w:val="1"/>
+      <w:numFmt w:val="bullet"/>
+      <w:lvlText w:val=""/>
+      <w:lvlJc w:val="left"/>
+      <w:pPr>
+        <w:tabs>
+          <w:tab w:val="num" w:pos="5040"/>
+        </w:tabs>
+        <w:ind w:left="5040" w:hanging="360"/>
+      </w:pPr>
+      <w:rPr>
+        <w:rFonts w:ascii="Symbol" w:hAnsi="Symbol" w:hint="default"/>
+        <w:sz w:val="20"/>
+      </w:rPr>
+    </w:lvl>
+    <w:lvl w:ilvl="7" w:tentative="1">
+      <w:start w:val="1"/>
+      <w:numFmt w:val="bullet"/>
+      <w:lvlText w:val=""/>
+      <w:lvlJc w:val="left"/>
+      <w:pPr>
+        <w:tabs>
+          <w:tab w:val="num" w:pos="5760"/>
+        </w:tabs>
+        <w:ind w:left="5760" w:hanging="360"/>
+      </w:pPr>
+      <w:rPr>
+        <w:rFonts w:ascii="Symbol" w:hAnsi="Symbol" w:hint="default"/>
+        <w:sz w:val="20"/>
+      </w:rPr>
+    </w:lvl>
+    <w:lvl w:ilvl="8" w:tentative="1">
+      <w:start w:val="1"/>
+      <w:numFmt w:val="bullet"/>
+      <w:lvlText w:val=""/>
+      <w:lvlJc w:val="left"/>
+      <w:pPr>
+        <w:tabs>
+          <w:tab w:val="num" w:pos="6480"/>
+        </w:tabs>
+        <w:ind w:left="6480" w:hanging="360"/>
+      </w:pPr>
+      <w:rPr>
+        <w:rFonts w:ascii="Symbol" w:hAnsi="Symbol" w:hint="default"/>
+        <w:sz w:val="20"/>
+      </w:rPr>
+    </w:lvl>
+  </w:abstractNum>
+  <w:abstractNum w:abstractNumId="18" w15:restartNumberingAfterBreak="0">
     <w:nsid w:val="48E12224"/>
     <w:multiLevelType w:val="multilevel"/>
     <w:tmpl w:val="E32225D8"/>
@@ -6594,7 +7791,7 @@
       </w:rPr>
     </w:lvl>
   </w:abstractNum>
-  <w:abstractNum w:abstractNumId="15" w15:restartNumberingAfterBreak="0">
+  <w:abstractNum w:abstractNumId="19" w15:restartNumberingAfterBreak="0">
     <w:nsid w:val="596D6D36"/>
     <w:multiLevelType w:val="multilevel"/>
     <w:tmpl w:val="DAE892F6"/>
@@ -6743,7 +7940,7 @@
       </w:rPr>
     </w:lvl>
   </w:abstractNum>
-  <w:abstractNum w:abstractNumId="16" w15:restartNumberingAfterBreak="0">
+  <w:abstractNum w:abstractNumId="20" w15:restartNumberingAfterBreak="0">
     <w:nsid w:val="6E2B2883"/>
     <w:multiLevelType w:val="multilevel"/>
     <w:tmpl w:val="E24AEEAE"/>
@@ -6892,7 +8089,7 @@
       </w:rPr>
     </w:lvl>
   </w:abstractNum>
-  <w:abstractNum w:abstractNumId="17" w15:restartNumberingAfterBreak="0">
+  <w:abstractNum w:abstractNumId="21" w15:restartNumberingAfterBreak="0">
     <w:nsid w:val="70B3525E"/>
     <w:multiLevelType w:val="multilevel"/>
     <w:tmpl w:val="5F860380"/>
@@ -7041,7 +8238,7 @@
       </w:rPr>
     </w:lvl>
   </w:abstractNum>
-  <w:abstractNum w:abstractNumId="18" w15:restartNumberingAfterBreak="0">
+  <w:abstractNum w:abstractNumId="22" w15:restartNumberingAfterBreak="0">
     <w:nsid w:val="71A460F0"/>
     <w:multiLevelType w:val="multilevel"/>
     <w:tmpl w:val="E32225D8"/>
@@ -7218,34 +8415,46 @@
     <w:abstractNumId w:val="0"/>
   </w:num>
   <w:num w:numId="10" w16cid:durableId="1162349787">
+    <w:abstractNumId w:val="19"/>
+  </w:num>
+  <w:num w:numId="11" w16cid:durableId="1623342175">
+    <w:abstractNumId w:val="21"/>
+  </w:num>
+  <w:num w:numId="12" w16cid:durableId="1843004383">
     <w:abstractNumId w:val="15"/>
   </w:num>
-  <w:num w:numId="11" w16cid:durableId="1623342175">
+  <w:num w:numId="13" w16cid:durableId="96945581">
+    <w:abstractNumId w:val="14"/>
+  </w:num>
+  <w:num w:numId="14" w16cid:durableId="1022055811">
+    <w:abstractNumId w:val="13"/>
+  </w:num>
+  <w:num w:numId="15" w16cid:durableId="2146043896">
+    <w:abstractNumId w:val="12"/>
+  </w:num>
+  <w:num w:numId="16" w16cid:durableId="291205731">
+    <w:abstractNumId w:val="20"/>
+  </w:num>
+  <w:num w:numId="17" w16cid:durableId="672608614">
+    <w:abstractNumId w:val="18"/>
+  </w:num>
+  <w:num w:numId="18" w16cid:durableId="873344271">
+    <w:abstractNumId w:val="22"/>
+  </w:num>
+  <w:num w:numId="19" w16cid:durableId="1949972750">
+    <w:abstractNumId w:val="16"/>
+  </w:num>
+  <w:num w:numId="20" w16cid:durableId="637303431">
+    <w:abstractNumId w:val="9"/>
+  </w:num>
+  <w:num w:numId="21" w16cid:durableId="1866014072">
     <w:abstractNumId w:val="17"/>
   </w:num>
-  <w:num w:numId="12" w16cid:durableId="1843004383">
-    <w:abstractNumId w:val="12"/>
-  </w:num>
-  <w:num w:numId="13" w16cid:durableId="96945581">
-    <w:abstractNumId w:val="11"/>
-  </w:num>
-  <w:num w:numId="14" w16cid:durableId="1022055811">
+  <w:num w:numId="22" w16cid:durableId="740518496">
     <w:abstractNumId w:val="10"/>
   </w:num>
-  <w:num w:numId="15" w16cid:durableId="2146043896">
-    <w:abstractNumId w:val="9"/>
-  </w:num>
-  <w:num w:numId="16" w16cid:durableId="291205731">
-    <w:abstractNumId w:val="16"/>
-  </w:num>
-  <w:num w:numId="17" w16cid:durableId="672608614">
-    <w:abstractNumId w:val="14"/>
-  </w:num>
-  <w:num w:numId="18" w16cid:durableId="873344271">
-    <w:abstractNumId w:val="18"/>
-  </w:num>
-  <w:num w:numId="19" w16cid:durableId="1949972750">
-    <w:abstractNumId w:val="13"/>
+  <w:num w:numId="23" w16cid:durableId="1262445528">
+    <w:abstractNumId w:val="11"/>
   </w:num>
 </w:numbering>
 </file>
@@ -7856,6 +9065,7 @@
   <w:style w:type="character" w:default="1" w:styleId="Fuentedeprrafopredeter">
     <w:name w:val="Default Paragraph Font"/>
     <w:uiPriority w:val="1"/>
+    <w:semiHidden/>
     <w:unhideWhenUsed/>
   </w:style>
   <w:style w:type="table" w:default="1" w:styleId="Tablanormal">

</xml_diff>